<commit_message>
Apply scene fixes to four designs from the previous commit
The previous build used the unfixed scene lists for Smart Fella, Go To
Church, Choking Hazard and Stage 4 Liabetes; this rebuilds them with the
near-duplicate places and repeated actions replaced.

Co-Authored-By: Claude Opus 5.5 <noreply@anthropic.com>
Claude-Session: https://claude.ai/code/session_01GPqZdivFM5n1D47u3EvWMU
</commit_message>
<xml_diff>
--- a/prompts/Smart_Fella_Or_Fart_Smella_120_Reels.docx
+++ b/prompts/Smart_Fella_Or_Fart_Smella_120_Reels.docx
@@ -4115,7 +4115,7 @@
         <w:pStyle w:val="Heading1"/>
       </w:pPr>
       <w:r>
-        <w:t>66. Long Road Trip Car — 33-year-old American man with a shaved head and goatee</w:t>
+        <w:t>66. Highway Drive With Windows Down — 33-year-old American man with a shaved head and goatee</w:t>
       </w:r>
     </w:p>
     <w:p>
@@ -4159,7 +4159,7 @@
         <w:t xml:space="preserve">IMAGE PROMPT: </w:t>
       </w:r>
       <w:r>
-        <w:t>Use the attached mockup image as the EXACT T-shirt reference: the shirt in the image must be the shirt the person wears, unchanged. Preserve the exact wording “YOU'RE EITHER A / SMART FELLA / OR A / FART SMELLA”, the same typography, ink colours and graphic layout (thin white condensed caps, bold white slab-serif SMART FELLA, orange bars around thin OR A, bold orange slab-serif FART SMELLA), and the same black T-shirt presentation. Do not change, rewrite, shorten, add, remove, or rearrange any wording. Create a highly photorealistic 33-year-old American man with a shaved head and goatee in a realistic American setting at a long road trip car. The person is sitting in the passenger seat with the window down. Natural age-appropriate appearance, realistic skin texture, authentic hair, natural facial expression, realistic black cotton T-shirt with visible fabric weave and natural folds. The T-shirt and its graphic are the MAIN FOCUS. Keep the entire front design clearly visible, centered, sharp and readable. Real-life commercial lifestyle photography, natural lighting, realistic background, subtle depth of field, believable American environment, authentic camera perspective. IMAGE SIZE: 9:16 VERTICAL. No text anywhere except the shirt print itself: no logo, no watermark, no QR code, no altered typography, no additional graphic.</w:t>
+        <w:t>Use the attached mockup image as the EXACT T-shirt reference: the shirt in the image must be the shirt the person wears, unchanged. Preserve the exact wording “YOU'RE EITHER A / SMART FELLA / OR A / FART SMELLA”, the same typography, ink colours and graphic layout (thin white condensed caps, bold white slab-serif SMART FELLA, orange bars around thin OR A, bold orange slab-serif FART SMELLA), and the same black T-shirt presentation. Do not change, rewrite, shorten, add, remove, or rearrange any wording. Create a highly photorealistic 33-year-old American man with a shaved head and goatee in a realistic American setting at a highway drive with windows down. The person is sitting in the passenger seat with the window down. Natural age-appropriate appearance, realistic skin texture, authentic hair, natural facial expression, realistic black cotton T-shirt with visible fabric weave and natural folds. The T-shirt and its graphic are the MAIN FOCUS. Keep the entire front design clearly visible, centered, sharp and readable. Real-life commercial lifestyle photography, natural lighting, realistic background, subtle depth of field, believable American environment, authentic camera perspective. IMAGE SIZE: 9:16 VERTICAL. No text anywhere except the shirt print itself: no logo, no watermark, no QR code, no altered typography, no additional graphic.</w:t>
       </w:r>
     </w:p>
     <w:p>
@@ -4170,7 +4170,7 @@
         <w:t xml:space="preserve">VIDEO PROMPT: </w:t>
       </w:r>
       <w:r>
-        <w:t>Create a 10-second photorealistic 9:16 vertical USA lifestyle Reel that looks like genuine footage captured by a real person on a modern smartphone camera, not an AI-generated video. You MUST use the attached mockup image as the exact T-shirt: the person wears that exact shirt, with the identical graphic, wording, typography, ink colours and layout from the attached image, nothing redrawn or invented. Location: long road trip car. Main subject: 33-year-old American man with a shaved head and goatee wearing the exact T-shirt from the attached mockup image. Preserve the exact printed wording “YOU'RE EITHER A / SMART FELLA / OR A / FART SMELLA”. The person is sitting in the passenger seat with the window down. They speak naturally and spend most of the dialogue talking specifically about the T-shirt: “Read it carefully, then decide. The bold orange FART SMELLA is the best part.” Then they turn slightly left and right to show the print. Keep the T-shirt as the visual MAIN FOCUS for most of the 10 seconds. The camera should provide a clear front view of the complete graphic, with natural slight handheld movement and realistic autofocus. The person may gently point to, touch, straighten, or display the shirt while talking about its design, message, bold lettering, joke appeal, or gift value. Use natural American voice, realistic lip sync, authentic body movement, real cotton fabric behavior, natural wrinkles and folds, realistic lighting, and location-appropriate ambient sound. Add warm, natural background laughter from friends nearby, as if they just read the shirt. Make it feel like a real lifestyle Reel filmed in America. IMAGE/VIDEO FRAME: 9:16 VERTICAL. No CGI look, no 3D render, no cartoon, no plastic fabric, no artificial smooth movement, no distorted hands, no extra fingers, no altered wording, no added text, no captions or subtitles, no logo, no watermark, no QR code.</w:t>
+        <w:t>Create a 10-second photorealistic 9:16 vertical USA lifestyle Reel that looks like genuine footage captured by a real person on a modern smartphone camera, not an AI-generated video. You MUST use the attached mockup image as the exact T-shirt: the person wears that exact shirt, with the identical graphic, wording, typography, ink colours and layout from the attached image, nothing redrawn or invented. Location: highway drive with windows down. Main subject: 33-year-old American man with a shaved head and goatee wearing the exact T-shirt from the attached mockup image. Preserve the exact printed wording “YOU'RE EITHER A / SMART FELLA / OR A / FART SMELLA”. The person is sitting in the passenger seat with the window down. They speak naturally and spend most of the dialogue talking specifically about the T-shirt: “Read it carefully, then decide. The bold orange FART SMELLA is the best part.” Then they turn slightly left and right to show the print. Keep the T-shirt as the visual MAIN FOCUS for most of the 10 seconds. The camera should provide a clear front view of the complete graphic, with natural slight handheld movement and realistic autofocus. The person may gently point to, touch, straighten, or display the shirt while talking about its design, message, bold lettering, joke appeal, or gift value. Use natural American voice, realistic lip sync, authentic body movement, real cotton fabric behavior, natural wrinkles and folds, realistic lighting, and location-appropriate ambient sound. Add warm, natural background laughter from friends nearby, as if they just read the shirt. Make it feel like a real lifestyle Reel filmed in America. IMAGE/VIDEO FRAME: 9:16 VERTICAL. No CGI look, no 3D render, no cartoon, no plastic fabric, no artificial smooth movement, no distorted hands, no extra fingers, no altered wording, no added text, no captions or subtitles, no logo, no watermark, no QR code.</w:t>
       </w:r>
     </w:p>
     <w:p>
@@ -4178,7 +4178,7 @@
         <w:pStyle w:val="Heading1"/>
       </w:pPr>
       <w:r>
-        <w:t>67. Carpool To Work — 41-year-old American woman with curly auburn hair</w:t>
+        <w:t>67. Commuter Car Ride — 41-year-old American woman with curly auburn hair</w:t>
       </w:r>
     </w:p>
     <w:p>
@@ -4222,7 +4222,7 @@
         <w:t xml:space="preserve">IMAGE PROMPT: </w:t>
       </w:r>
       <w:r>
-        <w:t>Use the attached mockup image as the EXACT T-shirt reference: the shirt in the image must be the shirt the person wears, unchanged. Preserve the exact wording “YOU'RE EITHER A / SMART FELLA / OR A / FART SMELLA”, the same typography, ink colours and graphic layout (thin white condensed caps, bold white slab-serif SMART FELLA, orange bars around thin OR A, bold orange slab-serif FART SMELLA), and the same black T-shirt presentation. Do not change, rewrite, shorten, add, remove, or rearrange any wording. Create a highly photorealistic 41-year-old American woman with curly auburn hair in a realistic American setting at a carpool to work. The person is sitting in the driver's seat with a grin. Natural age-appropriate appearance, realistic skin texture, authentic hair, natural facial expression, realistic black cotton T-shirt with visible fabric weave and natural folds. The T-shirt and its graphic are the MAIN FOCUS. Keep the entire front design clearly visible, centered, sharp and readable. Real-life commercial lifestyle photography, natural lighting, realistic background, subtle depth of field, believable American environment, authentic camera perspective. IMAGE SIZE: 9:16 VERTICAL. No text anywhere except the shirt print itself: no logo, no watermark, no QR code, no altered typography, no additional graphic.</w:t>
+        <w:t>Use the attached mockup image as the EXACT T-shirt reference: the shirt in the image must be the shirt the person wears, unchanged. Preserve the exact wording “YOU'RE EITHER A / SMART FELLA / OR A / FART SMELLA”, the same typography, ink colours and graphic layout (thin white condensed caps, bold white slab-serif SMART FELLA, orange bars around thin OR A, bold orange slab-serif FART SMELLA), and the same black T-shirt presentation. Do not change, rewrite, shorten, add, remove, or rearrange any wording. Create a highly photorealistic 41-year-old American woman with curly auburn hair in a realistic American setting at a commuter car ride. The person is sitting in the driver's seat with a grin. Natural age-appropriate appearance, realistic skin texture, authentic hair, natural facial expression, realistic black cotton T-shirt with visible fabric weave and natural folds. The T-shirt and its graphic are the MAIN FOCUS. Keep the entire front design clearly visible, centered, sharp and readable. Real-life commercial lifestyle photography, natural lighting, realistic background, subtle depth of field, believable American environment, authentic camera perspective. IMAGE SIZE: 9:16 VERTICAL. No text anywhere except the shirt print itself: no logo, no watermark, no QR code, no altered typography, no additional graphic.</w:t>
       </w:r>
     </w:p>
     <w:p>
@@ -4233,7 +4233,7 @@
         <w:t xml:space="preserve">VIDEO PROMPT: </w:t>
       </w:r>
       <w:r>
-        <w:t>Create a 10-second photorealistic 9:16 vertical USA lifestyle Reel that looks like genuine footage captured by a real person on a modern smartphone camera, not an AI-generated video. You MUST use the attached mockup image as the exact T-shirt: the person wears that exact shirt, with the identical graphic, wording, typography, ink colours and layout from the attached image, nothing redrawn or invented. Location: carpool to work. Main subject: 41-year-old American woman with curly auburn hair wearing the exact T-shirt from the attached mockup image. Preserve the exact printed wording “YOU'RE EITHER A / SMART FELLA / OR A / FART SMELLA”. The person is sitting in the driver's seat with a grin. They speak naturally and spend most of the dialogue talking specifically about the T-shirt: “Okay, which one are you? The orange really pops against the black cotton.” Then they hold the hem out to show the whole graphic. Keep the T-shirt as the visual MAIN FOCUS for most of the 10 seconds. The camera should provide a clear front view of the complete graphic, with natural slight handheld movement and realistic autofocus. The person may gently point to, touch, straighten, or display the shirt while talking about its design, message, bold lettering, joke appeal, or gift value. Use natural American voice, realistic lip sync, authentic body movement, real cotton fabric behavior, natural wrinkles and folds, realistic lighting, and location-appropriate ambient sound. Include a friend off-camera laughing and saying "No way," mixed with natural ambient sound. Make it feel like a real lifestyle Reel filmed in America. IMAGE/VIDEO FRAME: 9:16 VERTICAL. No CGI look, no 3D render, no cartoon, no plastic fabric, no artificial smooth movement, no distorted hands, no extra fingers, no altered wording, no added text, no captions or subtitles, no logo, no watermark, no QR code.</w:t>
+        <w:t>Create a 10-second photorealistic 9:16 vertical USA lifestyle Reel that looks like genuine footage captured by a real person on a modern smartphone camera, not an AI-generated video. You MUST use the attached mockup image as the exact T-shirt: the person wears that exact shirt, with the identical graphic, wording, typography, ink colours and layout from the attached image, nothing redrawn or invented. Location: commuter car ride. Main subject: 41-year-old American woman with curly auburn hair wearing the exact T-shirt from the attached mockup image. Preserve the exact printed wording “YOU'RE EITHER A / SMART FELLA / OR A / FART SMELLA”. The person is sitting in the driver's seat with a grin. They speak naturally and spend most of the dialogue talking specifically about the T-shirt: “Okay, which one are you? The orange really pops against the black cotton.” Then they hold the hem out to show the whole graphic. Keep the T-shirt as the visual MAIN FOCUS for most of the 10 seconds. The camera should provide a clear front view of the complete graphic, with natural slight handheld movement and realistic autofocus. The person may gently point to, touch, straighten, or display the shirt while talking about its design, message, bold lettering, joke appeal, or gift value. Use natural American voice, realistic lip sync, authentic body movement, real cotton fabric behavior, natural wrinkles and folds, realistic lighting, and location-appropriate ambient sound. Include a friend off-camera laughing and saying "No way," mixed with natural ambient sound. Make it feel like a real lifestyle Reel filmed in America. IMAGE/VIDEO FRAME: 9:16 VERTICAL. No CGI look, no 3D render, no cartoon, no plastic fabric, no artificial smooth movement, no distorted hands, no extra fingers, no altered wording, no added text, no captions or subtitles, no logo, no watermark, no QR code.</w:t>
       </w:r>
     </w:p>
     <w:p>
@@ -4241,7 +4241,7 @@
         <w:pStyle w:val="Heading1"/>
       </w:pPr>
       <w:r>
-        <w:t>68. Elevator Ride — 33-year-old American woman with a messy bun</w:t>
+        <w:t>68. Hotel Elevator Ride — 33-year-old American woman with a messy bun</w:t>
       </w:r>
     </w:p>
     <w:p>
@@ -4285,7 +4285,7 @@
         <w:t xml:space="preserve">IMAGE PROMPT: </w:t>
       </w:r>
       <w:r>
-        <w:t>Use the attached mockup image as the EXACT T-shirt reference: the shirt in the image must be the shirt the person wears, unchanged. Preserve the exact wording “YOU'RE EITHER A / SMART FELLA / OR A / FART SMELLA”, the same typography, ink colours and graphic layout (thin white condensed caps, bold white slab-serif SMART FELLA, orange bars around thin OR A, bold orange slab-serif FART SMELLA), and the same black T-shirt presentation. Do not change, rewrite, shorten, add, remove, or rearrange any wording. Create a highly photorealistic 33-year-old American woman with a messy bun in a realistic American setting at an elevator ride. The person is standing innocently with hands behind the back. Natural age-appropriate appearance, realistic skin texture, authentic hair, natural facial expression, realistic black cotton T-shirt with visible fabric weave and natural folds. The T-shirt and its graphic are the MAIN FOCUS. Keep the entire front design clearly visible, centered, sharp and readable. Real-life commercial lifestyle photography, natural lighting, realistic background, subtle depth of field, believable American environment, authentic camera perspective. IMAGE SIZE: 9:16 VERTICAL. No text anywhere except the shirt print itself: no logo, no watermark, no QR code, no altered typography, no additional graphic.</w:t>
+        <w:t>Use the attached mockup image as the EXACT T-shirt reference: the shirt in the image must be the shirt the person wears, unchanged. Preserve the exact wording “YOU'RE EITHER A / SMART FELLA / OR A / FART SMELLA”, the same typography, ink colours and graphic layout (thin white condensed caps, bold white slab-serif SMART FELLA, orange bars around thin OR A, bold orange slab-serif FART SMELLA), and the same black T-shirt presentation. Do not change, rewrite, shorten, add, remove, or rearrange any wording. Create a highly photorealistic 33-year-old American woman with a messy bun in a realistic American setting at a hotel elevator ride. The person is standing innocently with hands behind the back. Natural age-appropriate appearance, realistic skin texture, authentic hair, natural facial expression, realistic black cotton T-shirt with visible fabric weave and natural folds. The T-shirt and its graphic are the MAIN FOCUS. Keep the entire front design clearly visible, centered, sharp and readable. Real-life commercial lifestyle photography, natural lighting, realistic background, subtle depth of field, believable American environment, authentic camera perspective. IMAGE SIZE: 9:16 VERTICAL. No text anywhere except the shirt print itself: no logo, no watermark, no QR code, no altered typography, no additional graphic.</w:t>
       </w:r>
     </w:p>
     <w:p>
@@ -4296,7 +4296,7 @@
         <w:t xml:space="preserve">VIDEO PROMPT: </w:t>
       </w:r>
       <w:r>
-        <w:t>Create a 10-second photorealistic 9:16 vertical USA lifestyle Reel that looks like genuine footage captured by a real person on a modern smartphone camera, not an AI-generated video. You MUST use the attached mockup image as the exact T-shirt: the person wears that exact shirt, with the identical graphic, wording, typography, ink colours and layout from the attached image, nothing redrawn or invented. Location: elevator ride. Main subject: 33-year-old American woman with a messy bun wearing the exact T-shirt from the attached mockup image. Preserve the exact printed wording “YOU'RE EITHER A / SMART FELLA / OR A / FART SMELLA”. The person is standing innocently with hands behind the back. They speak naturally and spend most of the dialogue talking specifically about the T-shirt: “Okay, which one are you? Still looks sharp after a lot of washes.” Then they smooth the shirt flat with both hands. Keep the T-shirt as the visual MAIN FOCUS for most of the 10 seconds. The camera should provide a clear front view of the complete graphic, with natural slight handheld movement and realistic autofocus. The person may gently point to, touch, straighten, or display the shirt while talking about its design, message, bold lettering, joke appeal, or gift value. Use natural American voice, realistic lip sync, authentic body movement, real cotton fabric behavior, natural wrinkles and folds, realistic lighting, and location-appropriate ambient sound. Include a friend off-camera laughing and saying "No way," mixed with natural ambient sound. Make it feel like a real lifestyle Reel filmed in America. IMAGE/VIDEO FRAME: 9:16 VERTICAL. No CGI look, no 3D render, no cartoon, no plastic fabric, no artificial smooth movement, no distorted hands, no extra fingers, no altered wording, no added text, no captions or subtitles, no logo, no watermark, no QR code.</w:t>
+        <w:t>Create a 10-second photorealistic 9:16 vertical USA lifestyle Reel that looks like genuine footage captured by a real person on a modern smartphone camera, not an AI-generated video. You MUST use the attached mockup image as the exact T-shirt: the person wears that exact shirt, with the identical graphic, wording, typography, ink colours and layout from the attached image, nothing redrawn or invented. Location: hotel elevator ride. Main subject: 33-year-old American woman with a messy bun wearing the exact T-shirt from the attached mockup image. Preserve the exact printed wording “YOU'RE EITHER A / SMART FELLA / OR A / FART SMELLA”. The person is standing innocently with hands behind the back. They speak naturally and spend most of the dialogue talking specifically about the T-shirt: “Okay, which one are you? Still looks sharp after a lot of washes.” Then they smooth the shirt flat with both hands. Keep the T-shirt as the visual MAIN FOCUS for most of the 10 seconds. The camera should provide a clear front view of the complete graphic, with natural slight handheld movement and realistic autofocus. The person may gently point to, touch, straighten, or display the shirt while talking about its design, message, bold lettering, joke appeal, or gift value. Use natural American voice, realistic lip sync, authentic body movement, real cotton fabric behavior, natural wrinkles and folds, realistic lighting, and location-appropriate ambient sound. Include a friend off-camera laughing and saying "No way," mixed with natural ambient sound. Make it feel like a real lifestyle Reel filmed in America. IMAGE/VIDEO FRAME: 9:16 VERTICAL. No CGI look, no 3D render, no cartoon, no plastic fabric, no artificial smooth movement, no distorted hands, no extra fingers, no altered wording, no added text, no captions or subtitles, no logo, no watermark, no QR code.</w:t>
       </w:r>
     </w:p>
     <w:p>
@@ -4430,7 +4430,7 @@
         <w:pStyle w:val="Heading1"/>
       </w:pPr>
       <w:r>
-        <w:t>71. Cubicle Neighbor — 39-year-old American man with wavy brown hair</w:t>
+        <w:t>71. Shared Workspace Partition — 39-year-old American man with wavy brown hair</w:t>
       </w:r>
     </w:p>
     <w:p>
@@ -4474,7 +4474,7 @@
         <w:t xml:space="preserve">IMAGE PROMPT: </w:t>
       </w:r>
       <w:r>
-        <w:t>Use the attached mockup image as the EXACT T-shirt reference: the shirt in the image must be the shirt the person wears, unchanged. Preserve the exact wording “YOU'RE EITHER A / SMART FELLA / OR A / FART SMELLA”, the same typography, ink colours and graphic layout (thin white condensed caps, bold white slab-serif SMART FELLA, orange bars around thin OR A, bold orange slab-serif FART SMELLA), and the same black T-shirt presentation. Do not change, rewrite, shorten, add, remove, or rearrange any wording. Create a highly photorealistic 39-year-old American man with wavy brown hair in a realistic American setting at a cubicle neighbor. The person is peeking over a cubicle wall. Natural age-appropriate appearance, realistic skin texture, authentic hair, natural facial expression, realistic black cotton T-shirt with visible fabric weave and natural folds. The T-shirt and its graphic are the MAIN FOCUS. Keep the entire front design clearly visible, centered, sharp and readable. Real-life commercial lifestyle photography, natural lighting, realistic background, subtle depth of field, believable American environment, authentic camera perspective. IMAGE SIZE: 9:16 VERTICAL. No text anywhere except the shirt print itself: no logo, no watermark, no QR code, no altered typography, no additional graphic.</w:t>
+        <w:t>Use the attached mockup image as the EXACT T-shirt reference: the shirt in the image must be the shirt the person wears, unchanged. Preserve the exact wording “YOU'RE EITHER A / SMART FELLA / OR A / FART SMELLA”, the same typography, ink colours and graphic layout (thin white condensed caps, bold white slab-serif SMART FELLA, orange bars around thin OR A, bold orange slab-serif FART SMELLA), and the same black T-shirt presentation. Do not change, rewrite, shorten, add, remove, or rearrange any wording. Create a highly photorealistic 39-year-old American man with wavy brown hair in a realistic American setting at a shared workspace partition. The person is peeking over a cubicle wall. Natural age-appropriate appearance, realistic skin texture, authentic hair, natural facial expression, realistic black cotton T-shirt with visible fabric weave and natural folds. The T-shirt and its graphic are the MAIN FOCUS. Keep the entire front design clearly visible, centered, sharp and readable. Real-life commercial lifestyle photography, natural lighting, realistic background, subtle depth of field, believable American environment, authentic camera perspective. IMAGE SIZE: 9:16 VERTICAL. No text anywhere except the shirt print itself: no logo, no watermark, no QR code, no altered typography, no additional graphic.</w:t>
       </w:r>
     </w:p>
     <w:p>
@@ -4485,7 +4485,7 @@
         <w:t xml:space="preserve">VIDEO PROMPT: </w:t>
       </w:r>
       <w:r>
-        <w:t>Create a 10-second photorealistic 9:16 vertical USA lifestyle Reel that looks like genuine footage captured by a real person on a modern smartphone camera, not an AI-generated video. You MUST use the attached mockup image as the exact T-shirt: the person wears that exact shirt, with the identical graphic, wording, typography, ink colours and layout from the attached image, nothing redrawn or invented. Location: cubicle neighbor. Main subject: 39-year-old American man with wavy brown hair wearing the exact T-shirt from the attached mockup image. Preserve the exact printed wording “YOU'RE EITHER A / SMART FELLA / OR A / FART SMELLA”. The person is peeking over a cubicle wall. They speak naturally and spend most of the dialogue talking specifically about the T-shirt: “Somebody had to say it. Silly, classic and a little bit gross.” Then they point at SMART FELLA and then shrug at FART SMELLA. Keep the T-shirt as the visual MAIN FOCUS for most of the 10 seconds. The camera should provide a clear front view of the complete graphic, with natural slight handheld movement and realistic autofocus. The person may gently point to, touch, straighten, or display the shirt while talking about its design, message, bold lettering, joke appeal, or gift value. Use natural American voice, realistic lip sync, authentic body movement, real cotton fabric behavior, natural wrinkles and folds, realistic lighting, and location-appropriate ambient sound. Add soft giggles and a short burst of laughter from people just off-camera. Make it feel like a real lifestyle Reel filmed in America. IMAGE/VIDEO FRAME: 9:16 VERTICAL. No CGI look, no 3D render, no cartoon, no plastic fabric, no artificial smooth movement, no distorted hands, no extra fingers, no altered wording, no added text, no captions or subtitles, no logo, no watermark, no QR code.</w:t>
+        <w:t>Create a 10-second photorealistic 9:16 vertical USA lifestyle Reel that looks like genuine footage captured by a real person on a modern smartphone camera, not an AI-generated video. You MUST use the attached mockup image as the exact T-shirt: the person wears that exact shirt, with the identical graphic, wording, typography, ink colours and layout from the attached image, nothing redrawn or invented. Location: shared workspace partition. Main subject: 39-year-old American man with wavy brown hair wearing the exact T-shirt from the attached mockup image. Preserve the exact printed wording “YOU'RE EITHER A / SMART FELLA / OR A / FART SMELLA”. The person is peeking over a cubicle wall. They speak naturally and spend most of the dialogue talking specifically about the T-shirt: “Somebody had to say it. Silly, classic and a little bit gross.” Then they point at SMART FELLA and then shrug at FART SMELLA. Keep the T-shirt as the visual MAIN FOCUS for most of the 10 seconds. The camera should provide a clear front view of the complete graphic, with natural slight handheld movement and realistic autofocus. The person may gently point to, touch, straighten, or display the shirt while talking about its design, message, bold lettering, joke appeal, or gift value. Use natural American voice, realistic lip sync, authentic body movement, real cotton fabric behavior, natural wrinkles and folds, realistic lighting, and location-appropriate ambient sound. Add soft giggles and a short burst of laughter from people just off-camera. Make it feel like a real lifestyle Reel filmed in America. IMAGE/VIDEO FRAME: 9:16 VERTICAL. No CGI look, no 3D render, no cartoon, no plastic fabric, no artificial smooth movement, no distorted hands, no extra fingers, no altered wording, no added text, no captions or subtitles, no logo, no watermark, no QR code.</w:t>
       </w:r>
     </w:p>
     <w:p>
@@ -4871,7 +4871,7 @@
         <w:pStyle w:val="Heading1"/>
       </w:pPr>
       <w:r>
-        <w:t>78. Duck Blind — 62-year-old American woman with a messy bun</w:t>
+        <w:t>78. Waterfowl Marsh Boat — 62-year-old American woman with a messy bun</w:t>
       </w:r>
     </w:p>
     <w:p>
@@ -4915,7 +4915,7 @@
         <w:t xml:space="preserve">IMAGE PROMPT: </w:t>
       </w:r>
       <w:r>
-        <w:t>Use the attached mockup image as the EXACT T-shirt reference: the shirt in the image must be the shirt the person wears, unchanged. Preserve the exact wording “YOU'RE EITHER A / SMART FELLA / OR A / FART SMELLA”, the same typography, ink colours and graphic layout (thin white condensed caps, bold white slab-serif SMART FELLA, orange bars around thin OR A, bold orange slab-serif FART SMELLA), and the same black T-shirt presentation. Do not change, rewrite, shorten, add, remove, or rearrange any wording. Create a highly photorealistic 62-year-old American woman with a messy bun in a realistic American setting at a duck blind. The person is holding a thermos at dawn. Natural age-appropriate appearance, realistic skin texture, authentic hair, natural facial expression, realistic black cotton T-shirt with visible fabric weave and natural folds. The T-shirt and its graphic are the MAIN FOCUS. Keep the entire front design clearly visible, centered, sharp and readable. Real-life commercial lifestyle photography, natural lighting, realistic background, subtle depth of field, believable American environment, authentic camera perspective. IMAGE SIZE: 9:16 VERTICAL. No text anywhere except the shirt print itself: no logo, no watermark, no QR code, no altered typography, no additional graphic.</w:t>
+        <w:t>Use the attached mockup image as the EXACT T-shirt reference: the shirt in the image must be the shirt the person wears, unchanged. Preserve the exact wording “YOU'RE EITHER A / SMART FELLA / OR A / FART SMELLA”, the same typography, ink colours and graphic layout (thin white condensed caps, bold white slab-serif SMART FELLA, orange bars around thin OR A, bold orange slab-serif FART SMELLA), and the same black T-shirt presentation. Do not change, rewrite, shorten, add, remove, or rearrange any wording. Create a highly photorealistic 62-year-old American woman with a messy bun in a realistic American setting at a waterfowl marsh boat. The person is holding a thermos at dawn. Natural age-appropriate appearance, realistic skin texture, authentic hair, natural facial expression, realistic black cotton T-shirt with visible fabric weave and natural folds. The T-shirt and its graphic are the MAIN FOCUS. Keep the entire front design clearly visible, centered, sharp and readable. Real-life commercial lifestyle photography, natural lighting, realistic background, subtle depth of field, believable American environment, authentic camera perspective. IMAGE SIZE: 9:16 VERTICAL. No text anywhere except the shirt print itself: no logo, no watermark, no QR code, no altered typography, no additional graphic.</w:t>
       </w:r>
     </w:p>
     <w:p>
@@ -4926,7 +4926,7 @@
         <w:t xml:space="preserve">VIDEO PROMPT: </w:t>
       </w:r>
       <w:r>
-        <w:t>Create a 10-second photorealistic 9:16 vertical USA lifestyle Reel that looks like genuine footage captured by a real person on a modern smartphone camera, not an AI-generated video. You MUST use the attached mockup image as the exact T-shirt: the person wears that exact shirt, with the identical graphic, wording, typography, ink colours and layout from the attached image, nothing redrawn or invented. Location: duck blind. Main subject: 62-year-old American woman with a messy bun wearing the exact T-shirt from the attached mockup image. Preserve the exact printed wording “YOU'RE EITHER A / SMART FELLA / OR A / FART SMELLA”. The person is holding a thermos at dawn. They speak naturally and spend most of the dialogue talking specifically about the T-shirt: “Shirt check, smart edition. Great Father's Day gift for a dad who loves puns.” Then they point at SMART FELLA and then shrug at FART SMELLA. Keep the T-shirt as the visual MAIN FOCUS for most of the 10 seconds. The camera should provide a clear front view of the complete graphic, with natural slight handheld movement and realistic autofocus. The person may gently point to, touch, straighten, or display the shirt while talking about its design, message, bold lettering, joke appeal, or gift value. Use natural American voice, realistic lip sync, authentic body movement, real cotton fabric behavior, natural wrinkles and folds, realistic lighting, and location-appropriate ambient sound. Add warm, natural background laughter from friends nearby, as if they just read the shirt. Make it feel like a real lifestyle Reel filmed in America. IMAGE/VIDEO FRAME: 9:16 VERTICAL. No CGI look, no 3D render, no cartoon, no plastic fabric, no artificial smooth movement, no distorted hands, no extra fingers, no altered wording, no added text, no captions or subtitles, no logo, no watermark, no QR code.</w:t>
+        <w:t>Create a 10-second photorealistic 9:16 vertical USA lifestyle Reel that looks like genuine footage captured by a real person on a modern smartphone camera, not an AI-generated video. You MUST use the attached mockup image as the exact T-shirt: the person wears that exact shirt, with the identical graphic, wording, typography, ink colours and layout from the attached image, nothing redrawn or invented. Location: waterfowl marsh boat. Main subject: 62-year-old American woman with a messy bun wearing the exact T-shirt from the attached mockup image. Preserve the exact printed wording “YOU'RE EITHER A / SMART FELLA / OR A / FART SMELLA”. The person is holding a thermos at dawn. They speak naturally and spend most of the dialogue talking specifically about the T-shirt: “Shirt check, smart edition. Great Father's Day gift for a dad who loves puns.” Then they point at SMART FELLA and then shrug at FART SMELLA. Keep the T-shirt as the visual MAIN FOCUS for most of the 10 seconds. The camera should provide a clear front view of the complete graphic, with natural slight handheld movement and realistic autofocus. The person may gently point to, touch, straighten, or display the shirt while talking about its design, message, bold lettering, joke appeal, or gift value. Use natural American voice, realistic lip sync, authentic body movement, real cotton fabric behavior, natural wrinkles and folds, realistic lighting, and location-appropriate ambient sound. Add warm, natural background laughter from friends nearby, as if they just read the shirt. Make it feel like a real lifestyle Reel filmed in America. IMAGE/VIDEO FRAME: 9:16 VERTICAL. No CGI look, no 3D render, no cartoon, no plastic fabric, no artificial smooth movement, no distorted hands, no extra fingers, no altered wording, no added text, no captions or subtitles, no logo, no watermark, no QR code.</w:t>
       </w:r>
     </w:p>
     <w:p>
@@ -5060,7 +5060,7 @@
         <w:pStyle w:val="Heading1"/>
       </w:pPr>
       <w:r>
-        <w:t>81. Golf Cart — 56-year-old American man with a bright smile and laugh lines</w:t>
+        <w:t>81. Golf Course Snack Shack — 56-year-old American man with a bright smile and laugh lines</w:t>
       </w:r>
     </w:p>
     <w:p>
@@ -5104,7 +5104,7 @@
         <w:t xml:space="preserve">IMAGE PROMPT: </w:t>
       </w:r>
       <w:r>
-        <w:t>Use the attached mockup image as the EXACT T-shirt reference: the shirt in the image must be the shirt the person wears, unchanged. Preserve the exact wording “YOU'RE EITHER A / SMART FELLA / OR A / FART SMELLA”, the same typography, ink colours and graphic layout (thin white condensed caps, bold white slab-serif SMART FELLA, orange bars around thin OR A, bold orange slab-serif FART SMELLA), and the same black T-shirt presentation. Do not change, rewrite, shorten, add, remove, or rearrange any wording. Create a highly photorealistic 56-year-old American man with a bright smile and laugh lines in a realistic American setting at a golf cart. The person is driving with a buddy. Natural age-appropriate appearance, realistic skin texture, authentic hair, natural facial expression, realistic black cotton T-shirt with visible fabric weave and natural folds. The T-shirt and its graphic are the MAIN FOCUS. Keep the entire front design clearly visible, centered, sharp and readable. Real-life commercial lifestyle photography, natural lighting, realistic background, subtle depth of field, believable American environment, authentic camera perspective. IMAGE SIZE: 9:16 VERTICAL. No text anywhere except the shirt print itself: no logo, no watermark, no QR code, no altered typography, no additional graphic.</w:t>
+        <w:t>Use the attached mockup image as the EXACT T-shirt reference: the shirt in the image must be the shirt the person wears, unchanged. Preserve the exact wording “YOU'RE EITHER A / SMART FELLA / OR A / FART SMELLA”, the same typography, ink colours and graphic layout (thin white condensed caps, bold white slab-serif SMART FELLA, orange bars around thin OR A, bold orange slab-serif FART SMELLA), and the same black T-shirt presentation. Do not change, rewrite, shorten, add, remove, or rearrange any wording. Create a highly photorealistic 56-year-old American man with a bright smile and laugh lines in a realistic American setting at a golf course snack shack. The person is holding a hot dog with a buddy. Natural age-appropriate appearance, realistic skin texture, authentic hair, natural facial expression, realistic black cotton T-shirt with visible fabric weave and natural folds. The T-shirt and its graphic are the MAIN FOCUS. Keep the entire front design clearly visible, centered, sharp and readable. Real-life commercial lifestyle photography, natural lighting, realistic background, subtle depth of field, believable American environment, authentic camera perspective. IMAGE SIZE: 9:16 VERTICAL. No text anywhere except the shirt print itself: no logo, no watermark, no QR code, no altered typography, no additional graphic.</w:t>
       </w:r>
     </w:p>
     <w:p>
@@ -5115,7 +5115,7 @@
         <w:t xml:space="preserve">VIDEO PROMPT: </w:t>
       </w:r>
       <w:r>
-        <w:t>Create a 10-second photorealistic 9:16 vertical USA lifestyle Reel that looks like genuine footage captured by a real person on a modern smartphone camera, not an AI-generated video. You MUST use the attached mockup image as the exact T-shirt: the person wears that exact shirt, with the identical graphic, wording, typography, ink colours and layout from the attached image, nothing redrawn or invented. Location: golf cart. Main subject: 56-year-old American man with a bright smile and laugh lines wearing the exact T-shirt from the attached mockup image. Preserve the exact printed wording “YOU'RE EITHER A / SMART FELLA / OR A / FART SMELLA”. The person is driving with a buddy. They speak naturally and spend most of the dialogue talking specifically about the T-shirt: “I'm a smart fella, obviously. The orange bars around OR A tie it all together.” Then they laugh, look off-camera, and look back at the lens. Keep the T-shirt as the visual MAIN FOCUS for most of the 10 seconds. The camera should provide a clear front view of the complete graphic, with natural slight handheld movement and realistic autofocus. The person may gently point to, touch, straighten, or display the shirt while talking about its design, message, bold lettering, joke appeal, or gift value. Use natural American voice, realistic lip sync, authentic body movement, real cotton fabric behavior, natural wrinkles and folds, realistic lighting, and location-appropriate ambient sound. Add soft giggles and a short burst of laughter from people just off-camera. Make it feel like a real lifestyle Reel filmed in America. IMAGE/VIDEO FRAME: 9:16 VERTICAL. No CGI look, no 3D render, no cartoon, no plastic fabric, no artificial smooth movement, no distorted hands, no extra fingers, no altered wording, no added text, no captions or subtitles, no logo, no watermark, no QR code.</w:t>
+        <w:t>Create a 10-second photorealistic 9:16 vertical USA lifestyle Reel that looks like genuine footage captured by a real person on a modern smartphone camera, not an AI-generated video. You MUST use the attached mockup image as the exact T-shirt: the person wears that exact shirt, with the identical graphic, wording, typography, ink colours and layout from the attached image, nothing redrawn or invented. Location: golf course snack shack. Main subject: 56-year-old American man with a bright smile and laugh lines wearing the exact T-shirt from the attached mockup image. Preserve the exact printed wording “YOU'RE EITHER A / SMART FELLA / OR A / FART SMELLA”. The person is holding a hot dog with a buddy. They speak naturally and spend most of the dialogue talking specifically about the T-shirt: “I'm a smart fella, obviously. The orange bars around OR A tie it all together.” Then they laugh, look off-camera, and look back at the lens. Keep the T-shirt as the visual MAIN FOCUS for most of the 10 seconds. The camera should provide a clear front view of the complete graphic, with natural slight handheld movement and realistic autofocus. The person may gently point to, touch, straighten, or display the shirt while talking about its design, message, bold lettering, joke appeal, or gift value. Use natural American voice, realistic lip sync, authentic body movement, real cotton fabric behavior, natural wrinkles and folds, realistic lighting, and location-appropriate ambient sound. Add soft giggles and a short burst of laughter from people just off-camera. Make it feel like a real lifestyle Reel filmed in America. IMAGE/VIDEO FRAME: 9:16 VERTICAL. No CGI look, no 3D render, no cartoon, no plastic fabric, no artificial smooth movement, no distorted hands, no extra fingers, no altered wording, no added text, no captions or subtitles, no logo, no watermark, no QR code.</w:t>
       </w:r>
     </w:p>
     <w:p>
@@ -5186,7 +5186,7 @@
         <w:pStyle w:val="Heading1"/>
       </w:pPr>
       <w:r>
-        <w:t>83. Bowling League Night — 49-year-old American woman with short gray hair</w:t>
+        <w:t>83. Candlepin League Night — 49-year-old American woman with short gray hair</w:t>
       </w:r>
     </w:p>
     <w:p>
@@ -5230,7 +5230,7 @@
         <w:t xml:space="preserve">IMAGE PROMPT: </w:t>
       </w:r>
       <w:r>
-        <w:t>Use the attached mockup image as the EXACT T-shirt reference: the shirt in the image must be the shirt the person wears, unchanged. Preserve the exact wording “YOU'RE EITHER A / SMART FELLA / OR A / FART SMELLA”, the same typography, ink colours and graphic layout (thin white condensed caps, bold white slab-serif SMART FELLA, orange bars around thin OR A, bold orange slab-serif FART SMELLA), and the same black T-shirt presentation. Do not change, rewrite, shorten, add, remove, or rearrange any wording. Create a highly photorealistic 49-year-old American woman with short gray hair in a realistic American setting at a bowling league night. The person is holding a bowling ball. Natural age-appropriate appearance, realistic skin texture, authentic hair, natural facial expression, realistic black cotton T-shirt with visible fabric weave and natural folds. The T-shirt and its graphic are the MAIN FOCUS. Keep the entire front design clearly visible, centered, sharp and readable. Real-life commercial lifestyle photography, natural lighting, realistic background, subtle depth of field, believable American environment, authentic camera perspective. IMAGE SIZE: 9:16 VERTICAL. No text anywhere except the shirt print itself: no logo, no watermark, no QR code, no altered typography, no additional graphic.</w:t>
+        <w:t>Use the attached mockup image as the EXACT T-shirt reference: the shirt in the image must be the shirt the person wears, unchanged. Preserve the exact wording “YOU'RE EITHER A / SMART FELLA / OR A / FART SMELLA”, the same typography, ink colours and graphic layout (thin white condensed caps, bold white slab-serif SMART FELLA, orange bars around thin OR A, bold orange slab-serif FART SMELLA), and the same black T-shirt presentation. Do not change, rewrite, shorten, add, remove, or rearrange any wording. Create a highly photorealistic 49-year-old American woman with short gray hair in a realistic American setting at a candlepin league night. The person is holding a bowling ball. Natural age-appropriate appearance, realistic skin texture, authentic hair, natural facial expression, realistic black cotton T-shirt with visible fabric weave and natural folds. The T-shirt and its graphic are the MAIN FOCUS. Keep the entire front design clearly visible, centered, sharp and readable. Real-life commercial lifestyle photography, natural lighting, realistic background, subtle depth of field, believable American environment, authentic camera perspective. IMAGE SIZE: 9:16 VERTICAL. No text anywhere except the shirt print itself: no logo, no watermark, no QR code, no altered typography, no additional graphic.</w:t>
       </w:r>
     </w:p>
     <w:p>
@@ -5241,7 +5241,7 @@
         <w:t xml:space="preserve">VIDEO PROMPT: </w:t>
       </w:r>
       <w:r>
-        <w:t>Create a 10-second photorealistic 9:16 vertical USA lifestyle Reel that looks like genuine footage captured by a real person on a modern smartphone camera, not an AI-generated video. You MUST use the attached mockup image as the exact T-shirt: the person wears that exact shirt, with the identical graphic, wording, typography, ink colours and layout from the attached image, nothing redrawn or invented. Location: bowling league night. Main subject: 49-year-old American woman with short gray hair wearing the exact T-shirt from the attached mockup image. Preserve the exact printed wording “YOU'RE EITHER A / SMART FELLA / OR A / FART SMELLA”. The person is holding a bowling ball. They speak naturally and spend most of the dialogue talking specifically about the T-shirt: “Rate this shirt, one to ten. Still looks sharp after a lot of washes.” Then they smooth the shirt flat with both hands. Keep the T-shirt as the visual MAIN FOCUS for most of the 10 seconds. The camera should provide a clear front view of the complete graphic, with natural slight handheld movement and realistic autofocus. The person may gently point to, touch, straighten, or display the shirt while talking about its design, message, bold lettering, joke appeal, or gift value. Use natural American voice, realistic lip sync, authentic body movement, real cotton fabric behavior, natural wrinkles and folds, realistic lighting, and location-appropriate ambient sound. Add soft giggles and a short burst of laughter from people just off-camera. Make it feel like a real lifestyle Reel filmed in America. IMAGE/VIDEO FRAME: 9:16 VERTICAL. No CGI look, no 3D render, no cartoon, no plastic fabric, no artificial smooth movement, no distorted hands, no extra fingers, no altered wording, no added text, no captions or subtitles, no logo, no watermark, no QR code.</w:t>
+        <w:t>Create a 10-second photorealistic 9:16 vertical USA lifestyle Reel that looks like genuine footage captured by a real person on a modern smartphone camera, not an AI-generated video. You MUST use the attached mockup image as the exact T-shirt: the person wears that exact shirt, with the identical graphic, wording, typography, ink colours and layout from the attached image, nothing redrawn or invented. Location: candlepin league night. Main subject: 49-year-old American woman with short gray hair wearing the exact T-shirt from the attached mockup image. Preserve the exact printed wording “YOU'RE EITHER A / SMART FELLA / OR A / FART SMELLA”. The person is holding a bowling ball. They speak naturally and spend most of the dialogue talking specifically about the T-shirt: “Rate this shirt, one to ten. Still looks sharp after a lot of washes.” Then they smooth the shirt flat with both hands. Keep the T-shirt as the visual MAIN FOCUS for most of the 10 seconds. The camera should provide a clear front view of the complete graphic, with natural slight handheld movement and realistic autofocus. The person may gently point to, touch, straighten, or display the shirt while talking about its design, message, bold lettering, joke appeal, or gift value. Use natural American voice, realistic lip sync, authentic body movement, real cotton fabric behavior, natural wrinkles and folds, realistic lighting, and location-appropriate ambient sound. Add soft giggles and a short burst of laughter from people just off-camera. Make it feel like a real lifestyle Reel filmed in America. IMAGE/VIDEO FRAME: 9:16 VERTICAL. No CGI look, no 3D render, no cartoon, no plastic fabric, no artificial smooth movement, no distorted hands, no extra fingers, no altered wording, no added text, no captions or subtitles, no logo, no watermark, no QR code.</w:t>
       </w:r>
     </w:p>
     <w:p>
@@ -5249,7 +5249,7 @@
         <w:pStyle w:val="Heading1"/>
       </w:pPr>
       <w:r>
-        <w:t>84. Darts Night — 30-year-old American man with a backwards cap</w:t>
+        <w:t>84. Shuffleboard Night — 30-year-old American man with a backwards cap</w:t>
       </w:r>
     </w:p>
     <w:p>
@@ -5293,7 +5293,7 @@
         <w:t xml:space="preserve">IMAGE PROMPT: </w:t>
       </w:r>
       <w:r>
-        <w:t>Use the attached mockup image as the EXACT T-shirt reference: the shirt in the image must be the shirt the person wears, unchanged. Preserve the exact wording “YOU'RE EITHER A / SMART FELLA / OR A / FART SMELLA”, the same typography, ink colours and graphic layout (thin white condensed caps, bold white slab-serif SMART FELLA, orange bars around thin OR A, bold orange slab-serif FART SMELLA), and the same black T-shirt presentation. Do not change, rewrite, shorten, add, remove, or rearrange any wording. Create a highly photorealistic 30-year-old American man with a backwards cap in a realistic American setting at a darts night. The person is lining up a throw. Natural age-appropriate appearance, realistic skin texture, authentic hair, natural facial expression, realistic black cotton T-shirt with visible fabric weave and natural folds. The T-shirt and its graphic are the MAIN FOCUS. Keep the entire front design clearly visible, centered, sharp and readable. Real-life commercial lifestyle photography, natural lighting, realistic background, subtle depth of field, believable American environment, authentic camera perspective. IMAGE SIZE: 9:16 VERTICAL. No text anywhere except the shirt print itself: no logo, no watermark, no QR code, no altered typography, no additional graphic.</w:t>
+        <w:t>Use the attached mockup image as the EXACT T-shirt reference: the shirt in the image must be the shirt the person wears, unchanged. Preserve the exact wording “YOU'RE EITHER A / SMART FELLA / OR A / FART SMELLA”, the same typography, ink colours and graphic layout (thin white condensed caps, bold white slab-serif SMART FELLA, orange bars around thin OR A, bold orange slab-serif FART SMELLA), and the same black T-shirt presentation. Do not change, rewrite, shorten, add, remove, or rearrange any wording. Create a highly photorealistic 30-year-old American man with a backwards cap in a realistic American setting at a shuffleboard night. The person is sliding a puck down the table. Natural age-appropriate appearance, realistic skin texture, authentic hair, natural facial expression, realistic black cotton T-shirt with visible fabric weave and natural folds. The T-shirt and its graphic are the MAIN FOCUS. Keep the entire front design clearly visible, centered, sharp and readable. Real-life commercial lifestyle photography, natural lighting, realistic background, subtle depth of field, believable American environment, authentic camera perspective. IMAGE SIZE: 9:16 VERTICAL. No text anywhere except the shirt print itself: no logo, no watermark, no QR code, no altered typography, no additional graphic.</w:t>
       </w:r>
     </w:p>
     <w:p>
@@ -5304,7 +5304,7 @@
         <w:t xml:space="preserve">VIDEO PROMPT: </w:t>
       </w:r>
       <w:r>
-        <w:t>Create a 10-second photorealistic 9:16 vertical USA lifestyle Reel that looks like genuine footage captured by a real person on a modern smartphone camera, not an AI-generated video. You MUST use the attached mockup image as the exact T-shirt: the person wears that exact shirt, with the identical graphic, wording, typography, ink colours and layout from the attached image, nothing redrawn or invented. Location: darts night. Main subject: 30-year-old American man with a backwards cap wearing the exact T-shirt from the attached mockup image. Preserve the exact printed wording “YOU'RE EITHER A / SMART FELLA / OR A / FART SMELLA”. The person is lining up a throw. They speak naturally and spend most of the dialogue talking specifically about the T-shirt: “Read the orange part. Everyone reads it twice and starts laughing.” Then they point to each line one by one. Keep the T-shirt as the visual MAIN FOCUS for most of the 10 seconds. The camera should provide a clear front view of the complete graphic, with natural slight handheld movement and realistic autofocus. The person may gently point to, touch, straighten, or display the shirt while talking about its design, message, bold lettering, joke appeal, or gift value. Use natural American voice, realistic lip sync, authentic body movement, real cotton fabric behavior, natural wrinkles and folds, realistic lighting, and location-appropriate ambient sound. Include a friend off-camera laughing and saying "No way," mixed with natural ambient sound. Make it feel like a real lifestyle Reel filmed in America. IMAGE/VIDEO FRAME: 9:16 VERTICAL. No CGI look, no 3D render, no cartoon, no plastic fabric, no artificial smooth movement, no distorted hands, no extra fingers, no altered wording, no added text, no captions or subtitles, no logo, no watermark, no QR code.</w:t>
+        <w:t>Create a 10-second photorealistic 9:16 vertical USA lifestyle Reel that looks like genuine footage captured by a real person on a modern smartphone camera, not an AI-generated video. You MUST use the attached mockup image as the exact T-shirt: the person wears that exact shirt, with the identical graphic, wording, typography, ink colours and layout from the attached image, nothing redrawn or invented. Location: shuffleboard night. Main subject: 30-year-old American man with a backwards cap wearing the exact T-shirt from the attached mockup image. Preserve the exact printed wording “YOU'RE EITHER A / SMART FELLA / OR A / FART SMELLA”. The person is sliding a puck down the table. They speak naturally and spend most of the dialogue talking specifically about the T-shirt: “Read the orange part. Everyone reads it twice and starts laughing.” Then they point to each line one by one. Keep the T-shirt as the visual MAIN FOCUS for most of the 10 seconds. The camera should provide a clear front view of the complete graphic, with natural slight handheld movement and realistic autofocus. The person may gently point to, touch, straighten, or display the shirt while talking about its design, message, bold lettering, joke appeal, or gift value. Use natural American voice, realistic lip sync, authentic body movement, real cotton fabric behavior, natural wrinkles and folds, realistic lighting, and location-appropriate ambient sound. Include a friend off-camera laughing and saying "No way," mixed with natural ambient sound. Make it feel like a real lifestyle Reel filmed in America. IMAGE/VIDEO FRAME: 9:16 VERTICAL. No CGI look, no 3D render, no cartoon, no plastic fabric, no artificial smooth movement, no distorted hands, no extra fingers, no altered wording, no added text, no captions or subtitles, no logo, no watermark, no QR code.</w:t>
       </w:r>
     </w:p>
     <w:p>
@@ -5312,7 +5312,7 @@
         <w:pStyle w:val="Heading1"/>
       </w:pPr>
       <w:r>
-        <w:t>85. Pool Table At A Pub — 31-year-old American man with wavy brown hair</w:t>
+        <w:t>85. Billiards Lounge — 31-year-old American man with wavy brown hair</w:t>
       </w:r>
     </w:p>
     <w:p>
@@ -5356,7 +5356,7 @@
         <w:t xml:space="preserve">IMAGE PROMPT: </w:t>
       </w:r>
       <w:r>
-        <w:t>Use the attached mockup image as the EXACT T-shirt reference: the shirt in the image must be the shirt the person wears, unchanged. Preserve the exact wording “YOU'RE EITHER A / SMART FELLA / OR A / FART SMELLA”, the same typography, ink colours and graphic layout (thin white condensed caps, bold white slab-serif SMART FELLA, orange bars around thin OR A, bold orange slab-serif FART SMELLA), and the same black T-shirt presentation. Do not change, rewrite, shorten, add, remove, or rearrange any wording. Create a highly photorealistic 31-year-old American man with wavy brown hair in a realistic American setting at a pool table at A pub. The person is chalking a cue. Natural age-appropriate appearance, realistic skin texture, authentic hair, natural facial expression, realistic black cotton T-shirt with visible fabric weave and natural folds. The T-shirt and its graphic are the MAIN FOCUS. Keep the entire front design clearly visible, centered, sharp and readable. Real-life commercial lifestyle photography, natural lighting, realistic background, subtle depth of field, believable American environment, authentic camera perspective. IMAGE SIZE: 9:16 VERTICAL. No text anywhere except the shirt print itself: no logo, no watermark, no QR code, no altered typography, no additional graphic.</w:t>
+        <w:t>Use the attached mockup image as the EXACT T-shirt reference: the shirt in the image must be the shirt the person wears, unchanged. Preserve the exact wording “YOU'RE EITHER A / SMART FELLA / OR A / FART SMELLA”, the same typography, ink colours and graphic layout (thin white condensed caps, bold white slab-serif SMART FELLA, orange bars around thin OR A, bold orange slab-serif FART SMELLA), and the same black T-shirt presentation. Do not change, rewrite, shorten, add, remove, or rearrange any wording. Create a highly photorealistic 31-year-old American man with wavy brown hair in a realistic American setting at a billiards lounge. The person is chalking a cue. Natural age-appropriate appearance, realistic skin texture, authentic hair, natural facial expression, realistic black cotton T-shirt with visible fabric weave and natural folds. The T-shirt and its graphic are the MAIN FOCUS. Keep the entire front design clearly visible, centered, sharp and readable. Real-life commercial lifestyle photography, natural lighting, realistic background, subtle depth of field, believable American environment, authentic camera perspective. IMAGE SIZE: 9:16 VERTICAL. No text anywhere except the shirt print itself: no logo, no watermark, no QR code, no altered typography, no additional graphic.</w:t>
       </w:r>
     </w:p>
     <w:p>
@@ -5367,7 +5367,7 @@
         <w:t xml:space="preserve">VIDEO PROMPT: </w:t>
       </w:r>
       <w:r>
-        <w:t>Create a 10-second photorealistic 9:16 vertical USA lifestyle Reel that looks like genuine footage captured by a real person on a modern smartphone camera, not an AI-generated video. You MUST use the attached mockup image as the exact T-shirt: the person wears that exact shirt, with the identical graphic, wording, typography, ink colours and layout from the attached image, nothing redrawn or invented. Location: pool table at A pub. Main subject: 31-year-old American man with wavy brown hair wearing the exact T-shirt from the attached mockup image. Preserve the exact printed wording “YOU'RE EITHER A / SMART FELLA / OR A / FART SMELLA”. The person is chalking a cue. They speak naturally and spend most of the dialogue talking specifically about the T-shirt: “This one gets a laugh every time. Everyone reads it twice and starts laughing.” Then they hold the hem out to show the whole graphic. Keep the T-shirt as the visual MAIN FOCUS for most of the 10 seconds. The camera should provide a clear front view of the complete graphic, with natural slight handheld movement and realistic autofocus. The person may gently point to, touch, straighten, or display the shirt while talking about its design, message, bold lettering, joke appeal, or gift value. Use natural American voice, realistic lip sync, authentic body movement, real cotton fabric behavior, natural wrinkles and folds, realistic lighting, and location-appropriate ambient sound. Add warm, natural background laughter from friends nearby, as if they just read the shirt. Make it feel like a real lifestyle Reel filmed in America. IMAGE/VIDEO FRAME: 9:16 VERTICAL. No CGI look, no 3D render, no cartoon, no plastic fabric, no artificial smooth movement, no distorted hands, no extra fingers, no altered wording, no added text, no captions or subtitles, no logo, no watermark, no QR code.</w:t>
+        <w:t>Create a 10-second photorealistic 9:16 vertical USA lifestyle Reel that looks like genuine footage captured by a real person on a modern smartphone camera, not an AI-generated video. You MUST use the attached mockup image as the exact T-shirt: the person wears that exact shirt, with the identical graphic, wording, typography, ink colours and layout from the attached image, nothing redrawn or invented. Location: billiards lounge. Main subject: 31-year-old American man with wavy brown hair wearing the exact T-shirt from the attached mockup image. Preserve the exact printed wording “YOU'RE EITHER A / SMART FELLA / OR A / FART SMELLA”. The person is chalking a cue. They speak naturally and spend most of the dialogue talking specifically about the T-shirt: “This one gets a laugh every time. Everyone reads it twice and starts laughing.” Then they hold the hem out to show the whole graphic. Keep the T-shirt as the visual MAIN FOCUS for most of the 10 seconds. The camera should provide a clear front view of the complete graphic, with natural slight handheld movement and realistic autofocus. The person may gently point to, touch, straighten, or display the shirt while talking about its design, message, bold lettering, joke appeal, or gift value. Use natural American voice, realistic lip sync, authentic body movement, real cotton fabric behavior, natural wrinkles and folds, realistic lighting, and location-appropriate ambient sound. Add warm, natural background laughter from friends nearby, as if they just read the shirt. Make it feel like a real lifestyle Reel filmed in America. IMAGE/VIDEO FRAME: 9:16 VERTICAL. No CGI look, no 3D render, no cartoon, no plastic fabric, no artificial smooth movement, no distorted hands, no extra fingers, no altered wording, no added text, no captions or subtitles, no logo, no watermark, no QR code.</w:t>
       </w:r>
     </w:p>
     <w:p>
@@ -5375,7 +5375,7 @@
         <w:pStyle w:val="Heading1"/>
       </w:pPr>
       <w:r>
-        <w:t>86. Poker Night Garage — 45-year-old American man with a buzz cut</w:t>
+        <w:t>86. Card Room At A Casino — 45-year-old American man with a buzz cut</w:t>
       </w:r>
     </w:p>
     <w:p>
@@ -5419,7 +5419,7 @@
         <w:t xml:space="preserve">IMAGE PROMPT: </w:t>
       </w:r>
       <w:r>
-        <w:t>Use the attached mockup image as the EXACT T-shirt reference: the shirt in the image must be the shirt the person wears, unchanged. Preserve the exact wording “YOU'RE EITHER A / SMART FELLA / OR A / FART SMELLA”, the same typography, ink colours and graphic layout (thin white condensed caps, bold white slab-serif SMART FELLA, orange bars around thin OR A, bold orange slab-serif FART SMELLA), and the same black T-shirt presentation. Do not change, rewrite, shorten, add, remove, or rearrange any wording. Create a highly photorealistic 45-year-old American man with a buzz cut in a realistic American setting at a poker night garage. The person is stacking chips. Natural age-appropriate appearance, realistic skin texture, authentic hair, natural facial expression, realistic black cotton T-shirt with visible fabric weave and natural folds. The T-shirt and its graphic are the MAIN FOCUS. Keep the entire front design clearly visible, centered, sharp and readable. Real-life commercial lifestyle photography, natural lighting, realistic background, subtle depth of field, believable American environment, authentic camera perspective. IMAGE SIZE: 9:16 VERTICAL. No text anywhere except the shirt print itself: no logo, no watermark, no QR code, no altered typography, no additional graphic.</w:t>
+        <w:t>Use the attached mockup image as the EXACT T-shirt reference: the shirt in the image must be the shirt the person wears, unchanged. Preserve the exact wording “YOU'RE EITHER A / SMART FELLA / OR A / FART SMELLA”, the same typography, ink colours and graphic layout (thin white condensed caps, bold white slab-serif SMART FELLA, orange bars around thin OR A, bold orange slab-serif FART SMELLA), and the same black T-shirt presentation. Do not change, rewrite, shorten, add, remove, or rearrange any wording. Create a highly photorealistic 45-year-old American man with a buzz cut in a realistic American setting at a card room at A casino. The person is stacking chips. Natural age-appropriate appearance, realistic skin texture, authentic hair, natural facial expression, realistic black cotton T-shirt with visible fabric weave and natural folds. The T-shirt and its graphic are the MAIN FOCUS. Keep the entire front design clearly visible, centered, sharp and readable. Real-life commercial lifestyle photography, natural lighting, realistic background, subtle depth of field, believable American environment, authentic camera perspective. IMAGE SIZE: 9:16 VERTICAL. No text anywhere except the shirt print itself: no logo, no watermark, no QR code, no altered typography, no additional graphic.</w:t>
       </w:r>
     </w:p>
     <w:p>
@@ -5430,7 +5430,7 @@
         <w:t xml:space="preserve">VIDEO PROMPT: </w:t>
       </w:r>
       <w:r>
-        <w:t>Create a 10-second photorealistic 9:16 vertical USA lifestyle Reel that looks like genuine footage captured by a real person on a modern smartphone camera, not an AI-generated video. You MUST use the attached mockup image as the exact T-shirt: the person wears that exact shirt, with the identical graphic, wording, typography, ink colours and layout from the attached image, nothing redrawn or invented. Location: poker night garage. Main subject: 45-year-old American man with a buzz cut wearing the exact T-shirt from the attached mockup image. Preserve the exact printed wording “YOU'RE EITHER A / SMART FELLA / OR A / FART SMELLA”. The person is stacking chips. They speak naturally and spend most of the dialogue talking specifically about the T-shirt: “Read the orange part. Still looks sharp after a lot of washes.” Then they turn slightly left and right to show the print. Keep the T-shirt as the visual MAIN FOCUS for most of the 10 seconds. The camera should provide a clear front view of the complete graphic, with natural slight handheld movement and realistic autofocus. The person may gently point to, touch, straighten, or display the shirt while talking about its design, message, bold lettering, joke appeal, or gift value. Use natural American voice, realistic lip sync, authentic body movement, real cotton fabric behavior, natural wrinkles and folds, realistic lighting, and location-appropriate ambient sound. Add warm, natural background laughter from friends nearby, as if they just read the shirt. Make it feel like a real lifestyle Reel filmed in America. IMAGE/VIDEO FRAME: 9:16 VERTICAL. No CGI look, no 3D render, no cartoon, no plastic fabric, no artificial smooth movement, no distorted hands, no extra fingers, no altered wording, no added text, no captions or subtitles, no logo, no watermark, no QR code.</w:t>
+        <w:t>Create a 10-second photorealistic 9:16 vertical USA lifestyle Reel that looks like genuine footage captured by a real person on a modern smartphone camera, not an AI-generated video. You MUST use the attached mockup image as the exact T-shirt: the person wears that exact shirt, with the identical graphic, wording, typography, ink colours and layout from the attached image, nothing redrawn or invented. Location: card room at A casino. Main subject: 45-year-old American man with a buzz cut wearing the exact T-shirt from the attached mockup image. Preserve the exact printed wording “YOU'RE EITHER A / SMART FELLA / OR A / FART SMELLA”. The person is stacking chips. They speak naturally and spend most of the dialogue talking specifically about the T-shirt: “Read the orange part. Still looks sharp after a lot of washes.” Then they turn slightly left and right to show the print. Keep the T-shirt as the visual MAIN FOCUS for most of the 10 seconds. The camera should provide a clear front view of the complete graphic, with natural slight handheld movement and realistic autofocus. The person may gently point to, touch, straighten, or display the shirt while talking about its design, message, bold lettering, joke appeal, or gift value. Use natural American voice, realistic lip sync, authentic body movement, real cotton fabric behavior, natural wrinkles and folds, realistic lighting, and location-appropriate ambient sound. Add warm, natural background laughter from friends nearby, as if they just read the shirt. Make it feel like a real lifestyle Reel filmed in America. IMAGE/VIDEO FRAME: 9:16 VERTICAL. No CGI look, no 3D render, no cartoon, no plastic fabric, no artificial smooth movement, no distorted hands, no extra fingers, no altered wording, no added text, no captions or subtitles, no logo, no watermark, no QR code.</w:t>
       </w:r>
     </w:p>
     <w:p>
@@ -5501,7 +5501,7 @@
         <w:pStyle w:val="Heading1"/>
       </w:pPr>
       <w:r>
-        <w:t>88. Fantasy Football Draft Board — 37-year-old American woman with a messy bun</w:t>
+        <w:t>88. Fantasy League Trophy Night — 37-year-old American woman with a messy bun</w:t>
       </w:r>
     </w:p>
     <w:p>
@@ -5545,7 +5545,7 @@
         <w:t xml:space="preserve">IMAGE PROMPT: </w:t>
       </w:r>
       <w:r>
-        <w:t>Use the attached mockup image as the EXACT T-shirt reference: the shirt in the image must be the shirt the person wears, unchanged. Preserve the exact wording “YOU'RE EITHER A / SMART FELLA / OR A / FART SMELLA”, the same typography, ink colours and graphic layout (thin white condensed caps, bold white slab-serif SMART FELLA, orange bars around thin OR A, bold orange slab-serif FART SMELLA), and the same black T-shirt presentation. Do not change, rewrite, shorten, add, remove, or rearrange any wording. Create a highly photorealistic 37-year-old American woman with a messy bun in a realistic American setting at a fantasy football draft board. The person is holding a marker. Natural age-appropriate appearance, realistic skin texture, authentic hair, natural facial expression, realistic black cotton T-shirt with visible fabric weave and natural folds. The T-shirt and its graphic are the MAIN FOCUS. Keep the entire front design clearly visible, centered, sharp and readable. Real-life commercial lifestyle photography, natural lighting, realistic background, subtle depth of field, believable American environment, authentic camera perspective. IMAGE SIZE: 9:16 VERTICAL. No text anywhere except the shirt print itself: no logo, no watermark, no QR code, no altered typography, no additional graphic.</w:t>
+        <w:t>Use the attached mockup image as the EXACT T-shirt reference: the shirt in the image must be the shirt the person wears, unchanged. Preserve the exact wording “YOU'RE EITHER A / SMART FELLA / OR A / FART SMELLA”, the same typography, ink colours and graphic layout (thin white condensed caps, bold white slab-serif SMART FELLA, orange bars around thin OR A, bold orange slab-serif FART SMELLA), and the same black T-shirt presentation. Do not change, rewrite, shorten, add, remove, or rearrange any wording. Create a highly photorealistic 37-year-old American woman with a messy bun in a realistic American setting at a fantasy league trophy night. The person is holding a marker. Natural age-appropriate appearance, realistic skin texture, authentic hair, natural facial expression, realistic black cotton T-shirt with visible fabric weave and natural folds. The T-shirt and its graphic are the MAIN FOCUS. Keep the entire front design clearly visible, centered, sharp and readable. Real-life commercial lifestyle photography, natural lighting, realistic background, subtle depth of field, believable American environment, authentic camera perspective. IMAGE SIZE: 9:16 VERTICAL. No text anywhere except the shirt print itself: no logo, no watermark, no QR code, no altered typography, no additional graphic.</w:t>
       </w:r>
     </w:p>
     <w:p>
@@ -5556,7 +5556,7 @@
         <w:t xml:space="preserve">VIDEO PROMPT: </w:t>
       </w:r>
       <w:r>
-        <w:t>Create a 10-second photorealistic 9:16 vertical USA lifestyle Reel that looks like genuine footage captured by a real person on a modern smartphone camera, not an AI-generated video. You MUST use the attached mockup image as the exact T-shirt: the person wears that exact shirt, with the identical graphic, wording, typography, ink colours and layout from the attached image, nothing redrawn or invented. Location: fantasy football draft board. Main subject: 37-year-old American woman with a messy bun wearing the exact T-shirt from the attached mockup image. Preserve the exact printed wording “YOU'RE EITHER A / SMART FELLA / OR A / FART SMELLA”. The person is holding a marker. They speak naturally and spend most of the dialogue talking specifically about the T-shirt: “There's no third option. Everyone reads it twice and starts laughing.” Then they laugh, look off-camera, and look back at the lens. Keep the T-shirt as the visual MAIN FOCUS for most of the 10 seconds. The camera should provide a clear front view of the complete graphic, with natural slight handheld movement and realistic autofocus. The person may gently point to, touch, straighten, or display the shirt while talking about its design, message, bold lettering, joke appeal, or gift value. Use natural American voice, realistic lip sync, authentic body movement, real cotton fabric behavior, natural wrinkles and folds, realistic lighting, and location-appropriate ambient sound. Include a friend off-camera laughing and saying "No way," mixed with natural ambient sound. Make it feel like a real lifestyle Reel filmed in America. IMAGE/VIDEO FRAME: 9:16 VERTICAL. No CGI look, no 3D render, no cartoon, no plastic fabric, no artificial smooth movement, no distorted hands, no extra fingers, no altered wording, no added text, no captions or subtitles, no logo, no watermark, no QR code.</w:t>
+        <w:t>Create a 10-second photorealistic 9:16 vertical USA lifestyle Reel that looks like genuine footage captured by a real person on a modern smartphone camera, not an AI-generated video. You MUST use the attached mockup image as the exact T-shirt: the person wears that exact shirt, with the identical graphic, wording, typography, ink colours and layout from the attached image, nothing redrawn or invented. Location: fantasy league trophy night. Main subject: 37-year-old American woman with a messy bun wearing the exact T-shirt from the attached mockup image. Preserve the exact printed wording “YOU'RE EITHER A / SMART FELLA / OR A / FART SMELLA”. The person is holding a marker. They speak naturally and spend most of the dialogue talking specifically about the T-shirt: “There's no third option. Everyone reads it twice and starts laughing.” Then they laugh, look off-camera, and look back at the lens. Keep the T-shirt as the visual MAIN FOCUS for most of the 10 seconds. The camera should provide a clear front view of the complete graphic, with natural slight handheld movement and realistic autofocus. The person may gently point to, touch, straighten, or display the shirt while talking about its design, message, bold lettering, joke appeal, or gift value. Use natural American voice, realistic lip sync, authentic body movement, real cotton fabric behavior, natural wrinkles and folds, realistic lighting, and location-appropriate ambient sound. Include a friend off-camera laughing and saying "No way," mixed with natural ambient sound. Make it feel like a real lifestyle Reel filmed in America. IMAGE/VIDEO FRAME: 9:16 VERTICAL. No CGI look, no 3D render, no cartoon, no plastic fabric, no artificial smooth movement, no distorted hands, no extra fingers, no altered wording, no added text, no captions or subtitles, no logo, no watermark, no QR code.</w:t>
       </w:r>
     </w:p>
     <w:p>
@@ -5564,7 +5564,7 @@
         <w:pStyle w:val="Heading1"/>
       </w:pPr>
       <w:r>
-        <w:t>89. Sports Bar Big Game — 56-year-old American man with black-framed glasses</w:t>
+        <w:t>89. Big Screen Pub — 56-year-old American man with black-framed glasses</w:t>
       </w:r>
     </w:p>
     <w:p>
@@ -5608,7 +5608,7 @@
         <w:t xml:space="preserve">IMAGE PROMPT: </w:t>
       </w:r>
       <w:r>
-        <w:t>Use the attached mockup image as the EXACT T-shirt reference: the shirt in the image must be the shirt the person wears, unchanged. Preserve the exact wording “YOU'RE EITHER A / SMART FELLA / OR A / FART SMELLA”, the same typography, ink colours and graphic layout (thin white condensed caps, bold white slab-serif SMART FELLA, orange bars around thin OR A, bold orange slab-serif FART SMELLA), and the same black T-shirt presentation. Do not change, rewrite, shorten, add, remove, or rearrange any wording. Create a highly photorealistic 56-year-old American man with black-framed glasses in a realistic American setting at a sports bar big game. The person is holding a beer and cheering. Natural age-appropriate appearance, realistic skin texture, authentic hair, natural facial expression, realistic black cotton T-shirt with visible fabric weave and natural folds. The T-shirt and its graphic are the MAIN FOCUS. Keep the entire front design clearly visible, centered, sharp and readable. Real-life commercial lifestyle photography, natural lighting, realistic background, subtle depth of field, believable American environment, authentic camera perspective. IMAGE SIZE: 9:16 VERTICAL. No text anywhere except the shirt print itself: no logo, no watermark, no QR code, no altered typography, no additional graphic.</w:t>
+        <w:t>Use the attached mockup image as the EXACT T-shirt reference: the shirt in the image must be the shirt the person wears, unchanged. Preserve the exact wording “YOU'RE EITHER A / SMART FELLA / OR A / FART SMELLA”, the same typography, ink colours and graphic layout (thin white condensed caps, bold white slab-serif SMART FELLA, orange bars around thin OR A, bold orange slab-serif FART SMELLA), and the same black T-shirt presentation. Do not change, rewrite, shorten, add, remove, or rearrange any wording. Create a highly photorealistic 56-year-old American man with black-framed glasses in a realistic American setting at a big screen pub. The person is holding a beer and cheering. Natural age-appropriate appearance, realistic skin texture, authentic hair, natural facial expression, realistic black cotton T-shirt with visible fabric weave and natural folds. The T-shirt and its graphic are the MAIN FOCUS. Keep the entire front design clearly visible, centered, sharp and readable. Real-life commercial lifestyle photography, natural lighting, realistic background, subtle depth of field, believable American environment, authentic camera perspective. IMAGE SIZE: 9:16 VERTICAL. No text anywhere except the shirt print itself: no logo, no watermark, no QR code, no altered typography, no additional graphic.</w:t>
       </w:r>
     </w:p>
     <w:p>
@@ -5619,7 +5619,7 @@
         <w:t xml:space="preserve">VIDEO PROMPT: </w:t>
       </w:r>
       <w:r>
-        <w:t>Create a 10-second photorealistic 9:16 vertical USA lifestyle Reel that looks like genuine footage captured by a real person on a modern smartphone camera, not an AI-generated video. You MUST use the attached mockup image as the exact T-shirt: the person wears that exact shirt, with the identical graphic, wording, typography, ink colours and layout from the attached image, nothing redrawn or invented. Location: sports bar big game. Main subject: 56-year-old American man with black-framed glasses wearing the exact T-shirt from the attached mockup image. Preserve the exact printed wording “YOU'RE EITHER A / SMART FELLA / OR A / FART SMELLA”. The person is holding a beer and cheering. They speak naturally and spend most of the dialogue talking specifically about the T-shirt: “Read the orange part. The orange bars around OR A tie it all together.” Then they laugh, look off-camera, and look back at the lens. Keep the T-shirt as the visual MAIN FOCUS for most of the 10 seconds. The camera should provide a clear front view of the complete graphic, with natural slight handheld movement and realistic autofocus. The person may gently point to, touch, straighten, or display the shirt while talking about its design, message, bold lettering, joke appeal, or gift value. Use natural American voice, realistic lip sync, authentic body movement, real cotton fabric behavior, natural wrinkles and folds, realistic lighting, and location-appropriate ambient sound. Include a friend off-camera laughing and saying "No way," mixed with natural ambient sound. Make it feel like a real lifestyle Reel filmed in America. IMAGE/VIDEO FRAME: 9:16 VERTICAL. No CGI look, no 3D render, no cartoon, no plastic fabric, no artificial smooth movement, no distorted hands, no extra fingers, no altered wording, no added text, no captions or subtitles, no logo, no watermark, no QR code.</w:t>
+        <w:t>Create a 10-second photorealistic 9:16 vertical USA lifestyle Reel that looks like genuine footage captured by a real person on a modern smartphone camera, not an AI-generated video. You MUST use the attached mockup image as the exact T-shirt: the person wears that exact shirt, with the identical graphic, wording, typography, ink colours and layout from the attached image, nothing redrawn or invented. Location: big screen pub. Main subject: 56-year-old American man with black-framed glasses wearing the exact T-shirt from the attached mockup image. Preserve the exact printed wording “YOU'RE EITHER A / SMART FELLA / OR A / FART SMELLA”. The person is holding a beer and cheering. They speak naturally and spend most of the dialogue talking specifically about the T-shirt: “Read the orange part. The orange bars around OR A tie it all together.” Then they laugh, look off-camera, and look back at the lens. Keep the T-shirt as the visual MAIN FOCUS for most of the 10 seconds. The camera should provide a clear front view of the complete graphic, with natural slight handheld movement and realistic autofocus. The person may gently point to, touch, straighten, or display the shirt while talking about its design, message, bold lettering, joke appeal, or gift value. Use natural American voice, realistic lip sync, authentic body movement, real cotton fabric behavior, natural wrinkles and folds, realistic lighting, and location-appropriate ambient sound. Include a friend off-camera laughing and saying "No way," mixed with natural ambient sound. Make it feel like a real lifestyle Reel filmed in America. IMAGE/VIDEO FRAME: 9:16 VERTICAL. No CGI look, no 3D render, no cartoon, no plastic fabric, no artificial smooth movement, no distorted hands, no extra fingers, no altered wording, no added text, no captions or subtitles, no logo, no watermark, no QR code.</w:t>
       </w:r>
     </w:p>
     <w:p>
@@ -6005,7 +6005,7 @@
         <w:pStyle w:val="Heading1"/>
       </w:pPr>
       <w:r>
-        <w:t>96. Hardware Store Checkout — 61-year-old American man with a worn ball cap</w:t>
+        <w:t>96. Farm Supply Checkout — 61-year-old American man with a worn ball cap</w:t>
       </w:r>
     </w:p>
     <w:p>
@@ -6049,7 +6049,7 @@
         <w:t xml:space="preserve">IMAGE PROMPT: </w:t>
       </w:r>
       <w:r>
-        <w:t>Use the attached mockup image as the EXACT T-shirt reference: the shirt in the image must be the shirt the person wears, unchanged. Preserve the exact wording “YOU'RE EITHER A / SMART FELLA / OR A / FART SMELLA”, the same typography, ink colours and graphic layout (thin white condensed caps, bold white slab-serif SMART FELLA, orange bars around thin OR A, bold orange slab-serif FART SMELLA), and the same black T-shirt presentation. Do not change, rewrite, shorten, add, remove, or rearrange any wording. Create a highly photorealistic 61-year-old American man with a worn ball cap in a realistic American setting at a hardware store checkout. The person is setting a toolbox on the counter. Natural age-appropriate appearance, realistic skin texture, authentic hair, natural facial expression, realistic black cotton T-shirt with visible fabric weave and natural folds. The T-shirt and its graphic are the MAIN FOCUS. Keep the entire front design clearly visible, centered, sharp and readable. Real-life commercial lifestyle photography, natural lighting, realistic background, subtle depth of field, believable American environment, authentic camera perspective. IMAGE SIZE: 9:16 VERTICAL. No text anywhere except the shirt print itself: no logo, no watermark, no QR code, no altered typography, no additional graphic.</w:t>
+        <w:t>Use the attached mockup image as the EXACT T-shirt reference: the shirt in the image must be the shirt the person wears, unchanged. Preserve the exact wording “YOU'RE EITHER A / SMART FELLA / OR A / FART SMELLA”, the same typography, ink colours and graphic layout (thin white condensed caps, bold white slab-serif SMART FELLA, orange bars around thin OR A, bold orange slab-serif FART SMELLA), and the same black T-shirt presentation. Do not change, rewrite, shorten, add, remove, or rearrange any wording. Create a highly photorealistic 61-year-old American man with a worn ball cap in a realistic American setting at a farm supply checkout. The person is setting a toolbox on the counter. Natural age-appropriate appearance, realistic skin texture, authentic hair, natural facial expression, realistic black cotton T-shirt with visible fabric weave and natural folds. The T-shirt and its graphic are the MAIN FOCUS. Keep the entire front design clearly visible, centered, sharp and readable. Real-life commercial lifestyle photography, natural lighting, realistic background, subtle depth of field, believable American environment, authentic camera perspective. IMAGE SIZE: 9:16 VERTICAL. No text anywhere except the shirt print itself: no logo, no watermark, no QR code, no altered typography, no additional graphic.</w:t>
       </w:r>
     </w:p>
     <w:p>
@@ -6060,7 +6060,7 @@
         <w:t xml:space="preserve">VIDEO PROMPT: </w:t>
       </w:r>
       <w:r>
-        <w:t>Create a 10-second photorealistic 9:16 vertical USA lifestyle Reel that looks like genuine footage captured by a real person on a modern smartphone camera, not an AI-generated video. You MUST use the attached mockup image as the exact T-shirt: the person wears that exact shirt, with the identical graphic, wording, typography, ink colours and layout from the attached image, nothing redrawn or invented. Location: hardware store checkout. Main subject: 61-year-old American man with a worn ball cap wearing the exact T-shirt from the attached mockup image. Preserve the exact printed wording “YOU'RE EITHER A / SMART FELLA / OR A / FART SMELLA”. The person is setting a toolbox on the counter. They speak naturally and spend most of the dialogue talking specifically about the T-shirt: “Okay, which one are you? The orange really pops against the black cotton.” Then they laugh, look off-camera, and look back at the lens. Keep the T-shirt as the visual MAIN FOCUS for most of the 10 seconds. The camera should provide a clear front view of the complete graphic, with natural slight handheld movement and realistic autofocus. The person may gently point to, touch, straighten, or display the shirt while talking about its design, message, bold lettering, joke appeal, or gift value. Use natural American voice, realistic lip sync, authentic body movement, real cotton fabric behavior, natural wrinkles and folds, realistic lighting, and location-appropriate ambient sound. Include a friend off-camera laughing and saying "No way," mixed with natural ambient sound. Make it feel like a real lifestyle Reel filmed in America. IMAGE/VIDEO FRAME: 9:16 VERTICAL. No CGI look, no 3D render, no cartoon, no plastic fabric, no artificial smooth movement, no distorted hands, no extra fingers, no altered wording, no added text, no captions or subtitles, no logo, no watermark, no QR code.</w:t>
+        <w:t>Create a 10-second photorealistic 9:16 vertical USA lifestyle Reel that looks like genuine footage captured by a real person on a modern smartphone camera, not an AI-generated video. You MUST use the attached mockup image as the exact T-shirt: the person wears that exact shirt, with the identical graphic, wording, typography, ink colours and layout from the attached image, nothing redrawn or invented. Location: farm supply checkout. Main subject: 61-year-old American man with a worn ball cap wearing the exact T-shirt from the attached mockup image. Preserve the exact printed wording “YOU'RE EITHER A / SMART FELLA / OR A / FART SMELLA”. The person is setting a toolbox on the counter. They speak naturally and spend most of the dialogue talking specifically about the T-shirt: “Okay, which one are you? The orange really pops against the black cotton.” Then they laugh, look off-camera, and look back at the lens. Keep the T-shirt as the visual MAIN FOCUS for most of the 10 seconds. The camera should provide a clear front view of the complete graphic, with natural slight handheld movement and realistic autofocus. The person may gently point to, touch, straighten, or display the shirt while talking about its design, message, bold lettering, joke appeal, or gift value. Use natural American voice, realistic lip sync, authentic body movement, real cotton fabric behavior, natural wrinkles and folds, realistic lighting, and location-appropriate ambient sound. Include a friend off-camera laughing and saying "No way," mixed with natural ambient sound. Make it feel like a real lifestyle Reel filmed in America. IMAGE/VIDEO FRAME: 9:16 VERTICAL. No CGI look, no 3D render, no cartoon, no plastic fabric, no artificial smooth movement, no distorted hands, no extra fingers, no altered wording, no added text, no captions or subtitles, no logo, no watermark, no QR code.</w:t>
       </w:r>
     </w:p>
     <w:p>
@@ -6131,7 +6131,7 @@
         <w:pStyle w:val="Heading1"/>
       </w:pPr>
       <w:r>
-        <w:t>98. Home Garage Workbench — 61-year-old American man with a flannel-style lumberjack beard</w:t>
+        <w:t>98. Woodshop Bench — 61-year-old American man with a flannel-style lumberjack beard</w:t>
       </w:r>
     </w:p>
     <w:p>
@@ -6175,7 +6175,7 @@
         <w:t xml:space="preserve">IMAGE PROMPT: </w:t>
       </w:r>
       <w:r>
-        <w:t>Use the attached mockup image as the EXACT T-shirt reference: the shirt in the image must be the shirt the person wears, unchanged. Preserve the exact wording “YOU'RE EITHER A / SMART FELLA / OR A / FART SMELLA”, the same typography, ink colours and graphic layout (thin white condensed caps, bold white slab-serif SMART FELLA, orange bars around thin OR A, bold orange slab-serif FART SMELLA), and the same black T-shirt presentation. Do not change, rewrite, shorten, add, remove, or rearrange any wording. Create a highly photorealistic 61-year-old American man with a flannel-style lumberjack beard in a realistic American setting at a home garage workbench. The person is sanding a board. Natural age-appropriate appearance, realistic skin texture, authentic hair, natural facial expression, realistic black cotton T-shirt with visible fabric weave and natural folds. The T-shirt and its graphic are the MAIN FOCUS. Keep the entire front design clearly visible, centered, sharp and readable. Real-life commercial lifestyle photography, natural lighting, realistic background, subtle depth of field, believable American environment, authentic camera perspective. IMAGE SIZE: 9:16 VERTICAL. No text anywhere except the shirt print itself: no logo, no watermark, no QR code, no altered typography, no additional graphic.</w:t>
+        <w:t>Use the attached mockup image as the EXACT T-shirt reference: the shirt in the image must be the shirt the person wears, unchanged. Preserve the exact wording “YOU'RE EITHER A / SMART FELLA / OR A / FART SMELLA”, the same typography, ink colours and graphic layout (thin white condensed caps, bold white slab-serif SMART FELLA, orange bars around thin OR A, bold orange slab-serif FART SMELLA), and the same black T-shirt presentation. Do not change, rewrite, shorten, add, remove, or rearrange any wording. Create a highly photorealistic 61-year-old American man with a flannel-style lumberjack beard in a realistic American setting at a woodshop bench. The person is sanding a board. Natural age-appropriate appearance, realistic skin texture, authentic hair, natural facial expression, realistic black cotton T-shirt with visible fabric weave and natural folds. The T-shirt and its graphic are the MAIN FOCUS. Keep the entire front design clearly visible, centered, sharp and readable. Real-life commercial lifestyle photography, natural lighting, realistic background, subtle depth of field, believable American environment, authentic camera perspective. IMAGE SIZE: 9:16 VERTICAL. No text anywhere except the shirt print itself: no logo, no watermark, no QR code, no altered typography, no additional graphic.</w:t>
       </w:r>
     </w:p>
     <w:p>
@@ -6186,7 +6186,7 @@
         <w:t xml:space="preserve">VIDEO PROMPT: </w:t>
       </w:r>
       <w:r>
-        <w:t>Create a 10-second photorealistic 9:16 vertical USA lifestyle Reel that looks like genuine footage captured by a real person on a modern smartphone camera, not an AI-generated video. You MUST use the attached mockup image as the exact T-shirt: the person wears that exact shirt, with the identical graphic, wording, typography, ink colours and layout from the attached image, nothing redrawn or invented. Location: home garage workbench. Main subject: 61-year-old American man with a flannel-style lumberjack beard wearing the exact T-shirt from the attached mockup image. Preserve the exact printed wording “YOU'RE EITHER A / SMART FELLA / OR A / FART SMELLA”. The person is sanding a board. They speak naturally and spend most of the dialogue talking specifically about the T-shirt: “My buddies all claim the first one. The orange bars around OR A tie it all together.” Then they laugh, look off-camera, and look back at the lens. Keep the T-shirt as the visual MAIN FOCUS for most of the 10 seconds. The camera should provide a clear front view of the complete graphic, with natural slight handheld movement and realistic autofocus. The person may gently point to, touch, straighten, or display the shirt while talking about its design, message, bold lettering, joke appeal, or gift value. Use natural American voice, realistic lip sync, authentic body movement, real cotton fabric behavior, natural wrinkles and folds, realistic lighting, and location-appropriate ambient sound. Add warm, natural background laughter from friends nearby, as if they just read the shirt. Make it feel like a real lifestyle Reel filmed in America. IMAGE/VIDEO FRAME: 9:16 VERTICAL. No CGI look, no 3D render, no cartoon, no plastic fabric, no artificial smooth movement, no distorted hands, no extra fingers, no altered wording, no added text, no captions or subtitles, no logo, no watermark, no QR code.</w:t>
+        <w:t>Create a 10-second photorealistic 9:16 vertical USA lifestyle Reel that looks like genuine footage captured by a real person on a modern smartphone camera, not an AI-generated video. You MUST use the attached mockup image as the exact T-shirt: the person wears that exact shirt, with the identical graphic, wording, typography, ink colours and layout from the attached image, nothing redrawn or invented. Location: woodshop bench. Main subject: 61-year-old American man with a flannel-style lumberjack beard wearing the exact T-shirt from the attached mockup image. Preserve the exact printed wording “YOU'RE EITHER A / SMART FELLA / OR A / FART SMELLA”. The person is sanding a board. They speak naturally and spend most of the dialogue talking specifically about the T-shirt: “My buddies all claim the first one. The orange bars around OR A tie it all together.” Then they laugh, look off-camera, and look back at the lens. Keep the T-shirt as the visual MAIN FOCUS for most of the 10 seconds. The camera should provide a clear front view of the complete graphic, with natural slight handheld movement and realistic autofocus. The person may gently point to, touch, straighten, or display the shirt while talking about its design, message, bold lettering, joke appeal, or gift value. Use natural American voice, realistic lip sync, authentic body movement, real cotton fabric behavior, natural wrinkles and folds, realistic lighting, and location-appropriate ambient sound. Add warm, natural background laughter from friends nearby, as if they just read the shirt. Make it feel like a real lifestyle Reel filmed in America. IMAGE/VIDEO FRAME: 9:16 VERTICAL. No CGI look, no 3D render, no cartoon, no plastic fabric, no artificial smooth movement, no distorted hands, no extra fingers, no altered wording, no added text, no captions or subtitles, no logo, no watermark, no QR code.</w:t>
       </w:r>
     </w:p>
     <w:p>
@@ -6635,7 +6635,7 @@
         <w:pStyle w:val="Heading1"/>
       </w:pPr>
       <w:r>
-        <w:t>106. Brewery Patio — 39-year-old American man with a worn ball cap</w:t>
+        <w:t>106. Beer Garden — 39-year-old American man with a worn ball cap</w:t>
       </w:r>
     </w:p>
     <w:p>
@@ -6679,7 +6679,7 @@
         <w:t xml:space="preserve">IMAGE PROMPT: </w:t>
       </w:r>
       <w:r>
-        <w:t>Use the attached mockup image as the EXACT T-shirt reference: the shirt in the image must be the shirt the person wears, unchanged. Preserve the exact wording “YOU'RE EITHER A / SMART FELLA / OR A / FART SMELLA”, the same typography, ink colours and graphic layout (thin white condensed caps, bold white slab-serif SMART FELLA, orange bars around thin OR A, bold orange slab-serif FART SMELLA), and the same black T-shirt presentation. Do not change, rewrite, shorten, add, remove, or rearrange any wording. Create a highly photorealistic 39-year-old American man with a worn ball cap in a realistic American setting at a brewery patio. The person is holding a pint. Natural age-appropriate appearance, realistic skin texture, authentic hair, natural facial expression, realistic black cotton T-shirt with visible fabric weave and natural folds. The T-shirt and its graphic are the MAIN FOCUS. Keep the entire front design clearly visible, centered, sharp and readable. Real-life commercial lifestyle photography, natural lighting, realistic background, subtle depth of field, believable American environment, authentic camera perspective. IMAGE SIZE: 9:16 VERTICAL. No text anywhere except the shirt print itself: no logo, no watermark, no QR code, no altered typography, no additional graphic.</w:t>
+        <w:t>Use the attached mockup image as the EXACT T-shirt reference: the shirt in the image must be the shirt the person wears, unchanged. Preserve the exact wording “YOU'RE EITHER A / SMART FELLA / OR A / FART SMELLA”, the same typography, ink colours and graphic layout (thin white condensed caps, bold white slab-serif SMART FELLA, orange bars around thin OR A, bold orange slab-serif FART SMELLA), and the same black T-shirt presentation. Do not change, rewrite, shorten, add, remove, or rearrange any wording. Create a highly photorealistic 39-year-old American man with a worn ball cap in a realistic American setting at a beer garden. The person is holding a pint. Natural age-appropriate appearance, realistic skin texture, authentic hair, natural facial expression, realistic black cotton T-shirt with visible fabric weave and natural folds. The T-shirt and its graphic are the MAIN FOCUS. Keep the entire front design clearly visible, centered, sharp and readable. Real-life commercial lifestyle photography, natural lighting, realistic background, subtle depth of field, believable American environment, authentic camera perspective. IMAGE SIZE: 9:16 VERTICAL. No text anywhere except the shirt print itself: no logo, no watermark, no QR code, no altered typography, no additional graphic.</w:t>
       </w:r>
     </w:p>
     <w:p>
@@ -6690,7 +6690,7 @@
         <w:t xml:space="preserve">VIDEO PROMPT: </w:t>
       </w:r>
       <w:r>
-        <w:t>Create a 10-second photorealistic 9:16 vertical USA lifestyle Reel that looks like genuine footage captured by a real person on a modern smartphone camera, not an AI-generated video. You MUST use the attached mockup image as the exact T-shirt: the person wears that exact shirt, with the identical graphic, wording, typography, ink colours and layout from the attached image, nothing redrawn or invented. Location: brewery patio. Main subject: 39-year-old American man with a worn ball cap wearing the exact T-shirt from the attached mockup image. Preserve the exact printed wording “YOU'RE EITHER A / SMART FELLA / OR A / FART SMELLA”. The person is holding a pint. They speak naturally and spend most of the dialogue talking specifically about the T-shirt: “My buddies all claim the first one. The orange really pops against the black cotton.” Then they smooth the shirt flat with both hands. Keep the T-shirt as the visual MAIN FOCUS for most of the 10 seconds. The camera should provide a clear front view of the complete graphic, with natural slight handheld movement and realistic autofocus. The person may gently point to, touch, straighten, or display the shirt while talking about its design, message, bold lettering, joke appeal, or gift value. Use natural American voice, realistic lip sync, authentic body movement, real cotton fabric behavior, natural wrinkles and folds, realistic lighting, and location-appropriate ambient sound. Include a friend off-camera laughing and saying "No way," mixed with natural ambient sound. Make it feel like a real lifestyle Reel filmed in America. IMAGE/VIDEO FRAME: 9:16 VERTICAL. No CGI look, no 3D render, no cartoon, no plastic fabric, no artificial smooth movement, no distorted hands, no extra fingers, no altered wording, no added text, no captions or subtitles, no logo, no watermark, no QR code.</w:t>
+        <w:t>Create a 10-second photorealistic 9:16 vertical USA lifestyle Reel that looks like genuine footage captured by a real person on a modern smartphone camera, not an AI-generated video. You MUST use the attached mockup image as the exact T-shirt: the person wears that exact shirt, with the identical graphic, wording, typography, ink colours and layout from the attached image, nothing redrawn or invented. Location: beer garden. Main subject: 39-year-old American man with a worn ball cap wearing the exact T-shirt from the attached mockup image. Preserve the exact printed wording “YOU'RE EITHER A / SMART FELLA / OR A / FART SMELLA”. The person is holding a pint. They speak naturally and spend most of the dialogue talking specifically about the T-shirt: “My buddies all claim the first one. The orange really pops against the black cotton.” Then they smooth the shirt flat with both hands. Keep the T-shirt as the visual MAIN FOCUS for most of the 10 seconds. The camera should provide a clear front view of the complete graphic, with natural slight handheld movement and realistic autofocus. The person may gently point to, touch, straighten, or display the shirt while talking about its design, message, bold lettering, joke appeal, or gift value. Use natural American voice, realistic lip sync, authentic body movement, real cotton fabric behavior, natural wrinkles and folds, realistic lighting, and location-appropriate ambient sound. Include a friend off-camera laughing and saying "No way," mixed with natural ambient sound. Make it feel like a real lifestyle Reel filmed in America. IMAGE/VIDEO FRAME: 9:16 VERTICAL. No CGI look, no 3D render, no cartoon, no plastic fabric, no artificial smooth movement, no distorted hands, no extra fingers, no altered wording, no added text, no captions or subtitles, no logo, no watermark, no QR code.</w:t>
       </w:r>
     </w:p>
     <w:p>
@@ -6824,7 +6824,7 @@
         <w:pStyle w:val="Heading1"/>
       </w:pPr>
       <w:r>
-        <w:t>109. Comedy Club Table — 29-year-old American man with a knit beanie</w:t>
+        <w:t>109. Stand-Up Open Mic — 29-year-old American man with a knit beanie</w:t>
       </w:r>
     </w:p>
     <w:p>
@@ -6868,7 +6868,7 @@
         <w:t xml:space="preserve">IMAGE PROMPT: </w:t>
       </w:r>
       <w:r>
-        <w:t>Use the attached mockup image as the EXACT T-shirt reference: the shirt in the image must be the shirt the person wears, unchanged. Preserve the exact wording “YOU'RE EITHER A / SMART FELLA / OR A / FART SMELLA”, the same typography, ink colours and graphic layout (thin white condensed caps, bold white slab-serif SMART FELLA, orange bars around thin OR A, bold orange slab-serif FART SMELLA), and the same black T-shirt presentation. Do not change, rewrite, shorten, add, remove, or rearrange any wording. Create a highly photorealistic 29-year-old American man with a knit beanie in a realistic American setting at a comedy club table. The person is laughing at a small table. Natural age-appropriate appearance, realistic skin texture, authentic hair, natural facial expression, realistic black cotton T-shirt with visible fabric weave and natural folds. The T-shirt and its graphic are the MAIN FOCUS. Keep the entire front design clearly visible, centered, sharp and readable. Real-life commercial lifestyle photography, natural lighting, realistic background, subtle depth of field, believable American environment, authentic camera perspective. IMAGE SIZE: 9:16 VERTICAL. No text anywhere except the shirt print itself: no logo, no watermark, no QR code, no altered typography, no additional graphic.</w:t>
+        <w:t>Use the attached mockup image as the EXACT T-shirt reference: the shirt in the image must be the shirt the person wears, unchanged. Preserve the exact wording “YOU'RE EITHER A / SMART FELLA / OR A / FART SMELLA”, the same typography, ink colours and graphic layout (thin white condensed caps, bold white slab-serif SMART FELLA, orange bars around thin OR A, bold orange slab-serif FART SMELLA), and the same black T-shirt presentation. Do not change, rewrite, shorten, add, remove, or rearrange any wording. Create a highly photorealistic 29-year-old American man with a knit beanie in a realistic American setting at a stand-up open mic. The person is laughing at a small table. Natural age-appropriate appearance, realistic skin texture, authentic hair, natural facial expression, realistic black cotton T-shirt with visible fabric weave and natural folds. The T-shirt and its graphic are the MAIN FOCUS. Keep the entire front design clearly visible, centered, sharp and readable. Real-life commercial lifestyle photography, natural lighting, realistic background, subtle depth of field, believable American environment, authentic camera perspective. IMAGE SIZE: 9:16 VERTICAL. No text anywhere except the shirt print itself: no logo, no watermark, no QR code, no altered typography, no additional graphic.</w:t>
       </w:r>
     </w:p>
     <w:p>
@@ -6879,7 +6879,7 @@
         <w:t xml:space="preserve">VIDEO PROMPT: </w:t>
       </w:r>
       <w:r>
-        <w:t>Create a 10-second photorealistic 9:16 vertical USA lifestyle Reel that looks like genuine footage captured by a real person on a modern smartphone camera, not an AI-generated video. You MUST use the attached mockup image as the exact T-shirt: the person wears that exact shirt, with the identical graphic, wording, typography, ink colours and layout from the attached image, nothing redrawn or invented. Location: comedy club table. Main subject: 29-year-old American man with a knit beanie wearing the exact T-shirt from the attached mockup image. Preserve the exact printed wording “YOU'RE EITHER A / SMART FELLA / OR A / FART SMELLA”. The person is laughing at a small table. They speak naturally and spend most of the dialogue talking specifically about the T-shirt: “Best gag gift I ever got. The white slab-serif SMART FELLA looks so classy.” Then they step back so the whole front is in frame. Keep the T-shirt as the visual MAIN FOCUS for most of the 10 seconds. The camera should provide a clear front view of the complete graphic, with natural slight handheld movement and realistic autofocus. The person may gently point to, touch, straighten, or display the shirt while talking about its design, message, bold lettering, joke appeal, or gift value. Use natural American voice, realistic lip sync, authentic body movement, real cotton fabric behavior, natural wrinkles and folds, realistic lighting, and location-appropriate ambient sound. Include a friend off-camera laughing and saying "No way," mixed with natural ambient sound. Make it feel like a real lifestyle Reel filmed in America. IMAGE/VIDEO FRAME: 9:16 VERTICAL. No CGI look, no 3D render, no cartoon, no plastic fabric, no artificial smooth movement, no distorted hands, no extra fingers, no altered wording, no added text, no captions or subtitles, no logo, no watermark, no QR code.</w:t>
+        <w:t>Create a 10-second photorealistic 9:16 vertical USA lifestyle Reel that looks like genuine footage captured by a real person on a modern smartphone camera, not an AI-generated video. You MUST use the attached mockup image as the exact T-shirt: the person wears that exact shirt, with the identical graphic, wording, typography, ink colours and layout from the attached image, nothing redrawn or invented. Location: stand-up open mic. Main subject: 29-year-old American man with a knit beanie wearing the exact T-shirt from the attached mockup image. Preserve the exact printed wording “YOU'RE EITHER A / SMART FELLA / OR A / FART SMELLA”. The person is laughing at a small table. They speak naturally and spend most of the dialogue talking specifically about the T-shirt: “Best gag gift I ever got. The white slab-serif SMART FELLA looks so classy.” Then they step back so the whole front is in frame. Keep the T-shirt as the visual MAIN FOCUS for most of the 10 seconds. The camera should provide a clear front view of the complete graphic, with natural slight handheld movement and realistic autofocus. The person may gently point to, touch, straighten, or display the shirt while talking about its design, message, bold lettering, joke appeal, or gift value. Use natural American voice, realistic lip sync, authentic body movement, real cotton fabric behavior, natural wrinkles and folds, realistic lighting, and location-appropriate ambient sound. Include a friend off-camera laughing and saying "No way," mixed with natural ambient sound. Make it feel like a real lifestyle Reel filmed in America. IMAGE/VIDEO FRAME: 9:16 VERTICAL. No CGI look, no 3D render, no cartoon, no plastic fabric, no artificial smooth movement, no distorted hands, no extra fingers, no altered wording, no added text, no captions or subtitles, no logo, no watermark, no QR code.</w:t>
       </w:r>
     </w:p>
     <w:p>
@@ -6887,7 +6887,7 @@
         <w:pStyle w:val="Heading1"/>
       </w:pPr>
       <w:r>
-        <w:t>110. Arcade Bar — 59-year-old American man with tattooed forearms</w:t>
+        <w:t>110. Pinball Lounge — 59-year-old American man with tattooed forearms</w:t>
       </w:r>
     </w:p>
     <w:p>
@@ -6931,7 +6931,7 @@
         <w:t xml:space="preserve">IMAGE PROMPT: </w:t>
       </w:r>
       <w:r>
-        <w:t>Use the attached mockup image as the EXACT T-shirt reference: the shirt in the image must be the shirt the person wears, unchanged. Preserve the exact wording “YOU'RE EITHER A / SMART FELLA / OR A / FART SMELLA”, the same typography, ink colours and graphic layout (thin white condensed caps, bold white slab-serif SMART FELLA, orange bars around thin OR A, bold orange slab-serif FART SMELLA), and the same black T-shirt presentation. Do not change, rewrite, shorten, add, remove, or rearrange any wording. Create a highly photorealistic 59-year-old American man with tattooed forearms in a realistic American setting at an arcade bar. The person is playing pinball. Natural age-appropriate appearance, realistic skin texture, authentic hair, natural facial expression, realistic black cotton T-shirt with visible fabric weave and natural folds. The T-shirt and its graphic are the MAIN FOCUS. Keep the entire front design clearly visible, centered, sharp and readable. Real-life commercial lifestyle photography, natural lighting, realistic background, subtle depth of field, believable American environment, authentic camera perspective. IMAGE SIZE: 9:16 VERTICAL. No text anywhere except the shirt print itself: no logo, no watermark, no QR code, no altered typography, no additional graphic.</w:t>
+        <w:t>Use the attached mockup image as the EXACT T-shirt reference: the shirt in the image must be the shirt the person wears, unchanged. Preserve the exact wording “YOU'RE EITHER A / SMART FELLA / OR A / FART SMELLA”, the same typography, ink colours and graphic layout (thin white condensed caps, bold white slab-serif SMART FELLA, orange bars around thin OR A, bold orange slab-serif FART SMELLA), and the same black T-shirt presentation. Do not change, rewrite, shorten, add, remove, or rearrange any wording. Create a highly photorealistic 59-year-old American man with tattooed forearms in a realistic American setting at a pinball lounge. The person is playing pinball. Natural age-appropriate appearance, realistic skin texture, authentic hair, natural facial expression, realistic black cotton T-shirt with visible fabric weave and natural folds. The T-shirt and its graphic are the MAIN FOCUS. Keep the entire front design clearly visible, centered, sharp and readable. Real-life commercial lifestyle photography, natural lighting, realistic background, subtle depth of field, believable American environment, authentic camera perspective. IMAGE SIZE: 9:16 VERTICAL. No text anywhere except the shirt print itself: no logo, no watermark, no QR code, no altered typography, no additional graphic.</w:t>
       </w:r>
     </w:p>
     <w:p>
@@ -6942,7 +6942,7 @@
         <w:t xml:space="preserve">VIDEO PROMPT: </w:t>
       </w:r>
       <w:r>
-        <w:t>Create a 10-second photorealistic 9:16 vertical USA lifestyle Reel that looks like genuine footage captured by a real person on a modern smartphone camera, not an AI-generated video. You MUST use the attached mockup image as the exact T-shirt: the person wears that exact shirt, with the identical graphic, wording, typography, ink colours and layout from the attached image, nothing redrawn or invented. Location: arcade bar. Main subject: 59-year-old American man with tattooed forearms wearing the exact T-shirt from the attached mockup image. Preserve the exact printed wording “YOU'RE EITHER A / SMART FELLA / OR A / FART SMELLA”. The person is playing pinball. They speak naturally and spend most of the dialogue talking specifically about the T-shirt: “Somebody had to say it. The bold orange FART SMELLA is the best part.” Then they laugh, look off-camera, and look back at the lens. Keep the T-shirt as the visual MAIN FOCUS for most of the 10 seconds. The camera should provide a clear front view of the complete graphic, with natural slight handheld movement and realistic autofocus. The person may gently point to, touch, straighten, or display the shirt while talking about its design, message, bold lettering, joke appeal, or gift value. Use natural American voice, realistic lip sync, authentic body movement, real cotton fabric behavior, natural wrinkles and folds, realistic lighting, and location-appropriate ambient sound. Background audio has natural chuckles from nearby adults, real and unpolished, not a laugh track. Make it feel like a real lifestyle Reel filmed in America. IMAGE/VIDEO FRAME: 9:16 VERTICAL. No CGI look, no 3D render, no cartoon, no plastic fabric, no artificial smooth movement, no distorted hands, no extra fingers, no altered wording, no added text, no captions or subtitles, no logo, no watermark, no QR code.</w:t>
+        <w:t>Create a 10-second photorealistic 9:16 vertical USA lifestyle Reel that looks like genuine footage captured by a real person on a modern smartphone camera, not an AI-generated video. You MUST use the attached mockup image as the exact T-shirt: the person wears that exact shirt, with the identical graphic, wording, typography, ink colours and layout from the attached image, nothing redrawn or invented. Location: pinball lounge. Main subject: 59-year-old American man with tattooed forearms wearing the exact T-shirt from the attached mockup image. Preserve the exact printed wording “YOU'RE EITHER A / SMART FELLA / OR A / FART SMELLA”. The person is playing pinball. They speak naturally and spend most of the dialogue talking specifically about the T-shirt: “Somebody had to say it. The bold orange FART SMELLA is the best part.” Then they laugh, look off-camera, and look back at the lens. Keep the T-shirt as the visual MAIN FOCUS for most of the 10 seconds. The camera should provide a clear front view of the complete graphic, with natural slight handheld movement and realistic autofocus. The person may gently point to, touch, straighten, or display the shirt while talking about its design, message, bold lettering, joke appeal, or gift value. Use natural American voice, realistic lip sync, authentic body movement, real cotton fabric behavior, natural wrinkles and folds, realistic lighting, and location-appropriate ambient sound. Background audio has natural chuckles from nearby adults, real and unpolished, not a laugh track. Make it feel like a real lifestyle Reel filmed in America. IMAGE/VIDEO FRAME: 9:16 VERTICAL. No CGI look, no 3D render, no cartoon, no plastic fabric, no artificial smooth movement, no distorted hands, no extra fingers, no altered wording, no added text, no captions or subtitles, no logo, no watermark, no QR code.</w:t>
       </w:r>
     </w:p>
     <w:p>
@@ -7202,7 +7202,7 @@
         <w:pStyle w:val="Heading1"/>
       </w:pPr>
       <w:r>
-        <w:t>115. Diner Breakfast — 62-year-old American woman with short dark pixie hair</w:t>
+        <w:t>115. Biscuit Shop Breakfast — 62-year-old American woman with short dark pixie hair</w:t>
       </w:r>
     </w:p>
     <w:p>
@@ -7246,7 +7246,7 @@
         <w:t xml:space="preserve">IMAGE PROMPT: </w:t>
       </w:r>
       <w:r>
-        <w:t>Use the attached mockup image as the EXACT T-shirt reference: the shirt in the image must be the shirt the person wears, unchanged. Preserve the exact wording “YOU'RE EITHER A / SMART FELLA / OR A / FART SMELLA”, the same typography, ink colours and graphic layout (thin white condensed caps, bold white slab-serif SMART FELLA, orange bars around thin OR A, bold orange slab-serif FART SMELLA), and the same black T-shirt presentation. Do not change, rewrite, shorten, add, remove, or rearrange any wording. Create a highly photorealistic 62-year-old American woman with short dark pixie hair in a realistic American setting at a diner breakfast. The person is holding a plate of biscuits and gravy. Natural age-appropriate appearance, realistic skin texture, authentic hair, natural facial expression, realistic black cotton T-shirt with visible fabric weave and natural folds. The T-shirt and its graphic are the MAIN FOCUS. Keep the entire front design clearly visible, centered, sharp and readable. Real-life commercial lifestyle photography, natural lighting, realistic background, subtle depth of field, believable American environment, authentic camera perspective. IMAGE SIZE: 9:16 VERTICAL. No text anywhere except the shirt print itself: no logo, no watermark, no QR code, no altered typography, no additional graphic.</w:t>
+        <w:t>Use the attached mockup image as the EXACT T-shirt reference: the shirt in the image must be the shirt the person wears, unchanged. Preserve the exact wording “YOU'RE EITHER A / SMART FELLA / OR A / FART SMELLA”, the same typography, ink colours and graphic layout (thin white condensed caps, bold white slab-serif SMART FELLA, orange bars around thin OR A, bold orange slab-serif FART SMELLA), and the same black T-shirt presentation. Do not change, rewrite, shorten, add, remove, or rearrange any wording. Create a highly photorealistic 62-year-old American woman with short dark pixie hair in a realistic American setting at a biscuit shop breakfast. The person is holding a plate of biscuits and gravy. Natural age-appropriate appearance, realistic skin texture, authentic hair, natural facial expression, realistic black cotton T-shirt with visible fabric weave and natural folds. The T-shirt and its graphic are the MAIN FOCUS. Keep the entire front design clearly visible, centered, sharp and readable. Real-life commercial lifestyle photography, natural lighting, realistic background, subtle depth of field, believable American environment, authentic camera perspective. IMAGE SIZE: 9:16 VERTICAL. No text anywhere except the shirt print itself: no logo, no watermark, no QR code, no altered typography, no additional graphic.</w:t>
       </w:r>
     </w:p>
     <w:p>
@@ -7257,7 +7257,7 @@
         <w:t xml:space="preserve">VIDEO PROMPT: </w:t>
       </w:r>
       <w:r>
-        <w:t>Create a 10-second photorealistic 9:16 vertical USA lifestyle Reel that looks like genuine footage captured by a real person on a modern smartphone camera, not an AI-generated video. You MUST use the attached mockup image as the exact T-shirt: the person wears that exact shirt, with the identical graphic, wording, typography, ink colours and layout from the attached image, nothing redrawn or invented. Location: diner breakfast. Main subject: 62-year-old American woman with short dark pixie hair wearing the exact T-shirt from the attached mockup image. Preserve the exact printed wording “YOU'RE EITHER A / SMART FELLA / OR A / FART SMELLA”. The person is holding a plate of biscuits and gravy. They speak naturally and spend most of the dialogue talking specifically about the T-shirt: “Rate this shirt, one to ten. Everyone reads it twice and starts laughing.” Then they waft the air with one hand and grin. Keep the T-shirt as the visual MAIN FOCUS for most of the 10 seconds. The camera should provide a clear front view of the complete graphic, with natural slight handheld movement and realistic autofocus. The person may gently point to, touch, straighten, or display the shirt while talking about its design, message, bold lettering, joke appeal, or gift value. Use natural American voice, realistic lip sync, authentic body movement, real cotton fabric behavior, natural wrinkles and folds, realistic lighting, and location-appropriate ambient sound. Add warm, natural background laughter from friends nearby, as if they just read the shirt. Make it feel like a real lifestyle Reel filmed in America. IMAGE/VIDEO FRAME: 9:16 VERTICAL. No CGI look, no 3D render, no cartoon, no plastic fabric, no artificial smooth movement, no distorted hands, no extra fingers, no altered wording, no added text, no captions or subtitles, no logo, no watermark, no QR code.</w:t>
+        <w:t>Create a 10-second photorealistic 9:16 vertical USA lifestyle Reel that looks like genuine footage captured by a real person on a modern smartphone camera, not an AI-generated video. You MUST use the attached mockup image as the exact T-shirt: the person wears that exact shirt, with the identical graphic, wording, typography, ink colours and layout from the attached image, nothing redrawn or invented. Location: biscuit shop breakfast. Main subject: 62-year-old American woman with short dark pixie hair wearing the exact T-shirt from the attached mockup image. Preserve the exact printed wording “YOU'RE EITHER A / SMART FELLA / OR A / FART SMELLA”. The person is holding a plate of biscuits and gravy. They speak naturally and spend most of the dialogue talking specifically about the T-shirt: “Rate this shirt, one to ten. Everyone reads it twice and starts laughing.” Then they waft the air with one hand and grin. Keep the T-shirt as the visual MAIN FOCUS for most of the 10 seconds. The camera should provide a clear front view of the complete graphic, with natural slight handheld movement and realistic autofocus. The person may gently point to, touch, straighten, or display the shirt while talking about its design, message, bold lettering, joke appeal, or gift value. Use natural American voice, realistic lip sync, authentic body movement, real cotton fabric behavior, natural wrinkles and folds, realistic lighting, and location-appropriate ambient sound. Add warm, natural background laughter from friends nearby, as if they just read the shirt. Make it feel like a real lifestyle Reel filmed in America. IMAGE/VIDEO FRAME: 9:16 VERTICAL. No CGI look, no 3D render, no cartoon, no plastic fabric, no artificial smooth movement, no distorted hands, no extra fingers, no altered wording, no added text, no captions or subtitles, no logo, no watermark, no QR code.</w:t>
       </w:r>
     </w:p>
     <w:p>
@@ -7328,7 +7328,7 @@
         <w:pStyle w:val="Heading1"/>
       </w:pPr>
       <w:r>
-        <w:t>117. Coffee Shop — 62-year-old American man with a salt-and-pepper beard</w:t>
+        <w:t>117. Espresso Bar — 62-year-old American man with a salt-and-pepper beard</w:t>
       </w:r>
     </w:p>
     <w:p>
@@ -7372,7 +7372,7 @@
         <w:t xml:space="preserve">IMAGE PROMPT: </w:t>
       </w:r>
       <w:r>
-        <w:t>Use the attached mockup image as the EXACT T-shirt reference: the shirt in the image must be the shirt the person wears, unchanged. Preserve the exact wording “YOU'RE EITHER A / SMART FELLA / OR A / FART SMELLA”, the same typography, ink colours and graphic layout (thin white condensed caps, bold white slab-serif SMART FELLA, orange bars around thin OR A, bold orange slab-serif FART SMELLA), and the same black T-shirt presentation. Do not change, rewrite, shorten, add, remove, or rearrange any wording. Create a highly photorealistic 62-year-old American man with a salt-and-pepper beard in a realistic American setting at a coffee shop. The person is holding a large coffee. Natural age-appropriate appearance, realistic skin texture, authentic hair, natural facial expression, realistic black cotton T-shirt with visible fabric weave and natural folds. The T-shirt and its graphic are the MAIN FOCUS. Keep the entire front design clearly visible, centered, sharp and readable. Real-life commercial lifestyle photography, natural lighting, realistic background, subtle depth of field, believable American environment, authentic camera perspective. IMAGE SIZE: 9:16 VERTICAL. No text anywhere except the shirt print itself: no logo, no watermark, no QR code, no altered typography, no additional graphic.</w:t>
+        <w:t>Use the attached mockup image as the EXACT T-shirt reference: the shirt in the image must be the shirt the person wears, unchanged. Preserve the exact wording “YOU'RE EITHER A / SMART FELLA / OR A / FART SMELLA”, the same typography, ink colours and graphic layout (thin white condensed caps, bold white slab-serif SMART FELLA, orange bars around thin OR A, bold orange slab-serif FART SMELLA), and the same black T-shirt presentation. Do not change, rewrite, shorten, add, remove, or rearrange any wording. Create a highly photorealistic 62-year-old American man with a salt-and-pepper beard in a realistic American setting at an espresso bar. The person is holding a large coffee. Natural age-appropriate appearance, realistic skin texture, authentic hair, natural facial expression, realistic black cotton T-shirt with visible fabric weave and natural folds. The T-shirt and its graphic are the MAIN FOCUS. Keep the entire front design clearly visible, centered, sharp and readable. Real-life commercial lifestyle photography, natural lighting, realistic background, subtle depth of field, believable American environment, authentic camera perspective. IMAGE SIZE: 9:16 VERTICAL. No text anywhere except the shirt print itself: no logo, no watermark, no QR code, no altered typography, no additional graphic.</w:t>
       </w:r>
     </w:p>
     <w:p>
@@ -7383,7 +7383,7 @@
         <w:t xml:space="preserve">VIDEO PROMPT: </w:t>
       </w:r>
       <w:r>
-        <w:t>Create a 10-second photorealistic 9:16 vertical USA lifestyle Reel that looks like genuine footage captured by a real person on a modern smartphone camera, not an AI-generated video. You MUST use the attached mockup image as the exact T-shirt: the person wears that exact shirt, with the identical graphic, wording, typography, ink colours and layout from the attached image, nothing redrawn or invented. Location: coffee shop. Main subject: 62-year-old American man with a salt-and-pepper beard wearing the exact T-shirt from the attached mockup image. Preserve the exact printed wording “YOU'RE EITHER A / SMART FELLA / OR A / FART SMELLA”. The person is holding a large coffee. They speak naturally and spend most of the dialogue talking specifically about the T-shirt: “Read the orange part. The wordplay gets everyone the second time.” Then they smooth the shirt flat with both hands. Keep the T-shirt as the visual MAIN FOCUS for most of the 10 seconds. The camera should provide a clear front view of the complete graphic, with natural slight handheld movement and realistic autofocus. The person may gently point to, touch, straighten, or display the shirt while talking about its design, message, bold lettering, joke appeal, or gift value. Use natural American voice, realistic lip sync, authentic body movement, real cotton fabric behavior, natural wrinkles and folds, realistic lighting, and location-appropriate ambient sound. Background audio has natural chuckles from nearby adults, real and unpolished, not a laugh track. Make it feel like a real lifestyle Reel filmed in America. IMAGE/VIDEO FRAME: 9:16 VERTICAL. No CGI look, no 3D render, no cartoon, no plastic fabric, no artificial smooth movement, no distorted hands, no extra fingers, no altered wording, no added text, no captions or subtitles, no logo, no watermark, no QR code.</w:t>
+        <w:t>Create a 10-second photorealistic 9:16 vertical USA lifestyle Reel that looks like genuine footage captured by a real person on a modern smartphone camera, not an AI-generated video. You MUST use the attached mockup image as the exact T-shirt: the person wears that exact shirt, with the identical graphic, wording, typography, ink colours and layout from the attached image, nothing redrawn or invented. Location: espresso bar. Main subject: 62-year-old American man with a salt-and-pepper beard wearing the exact T-shirt from the attached mockup image. Preserve the exact printed wording “YOU'RE EITHER A / SMART FELLA / OR A / FART SMELLA”. The person is holding a large coffee. They speak naturally and spend most of the dialogue talking specifically about the T-shirt: “Read the orange part. The wordplay gets everyone the second time.” Then they smooth the shirt flat with both hands. Keep the T-shirt as the visual MAIN FOCUS for most of the 10 seconds. The camera should provide a clear front view of the complete graphic, with natural slight handheld movement and realistic autofocus. The person may gently point to, touch, straighten, or display the shirt while talking about its design, message, bold lettering, joke appeal, or gift value. Use natural American voice, realistic lip sync, authentic body movement, real cotton fabric behavior, natural wrinkles and folds, realistic lighting, and location-appropriate ambient sound. Background audio has natural chuckles from nearby adults, real and unpolished, not a laugh track. Make it feel like a real lifestyle Reel filmed in America. IMAGE/VIDEO FRAME: 9:16 VERTICAL. No CGI look, no 3D render, no cartoon, no plastic fabric, no artificial smooth movement, no distorted hands, no extra fingers, no altered wording, no added text, no captions or subtitles, no logo, no watermark, no QR code.</w:t>
       </w:r>
     </w:p>
     <w:p>

</xml_diff>